<commit_message>
fix format file testscript PBL6
</commit_message>
<xml_diff>
--- a/test/PBI6_TestScript.docx
+++ b/test/PBI6_TestScript.docx
@@ -4,7 +4,7 @@
   <w:body>
     <w:tbl>
       <w:tblPr>
-        <w:tblStyle w:val="a8"/>
+        <w:tblStyle w:val="TableGrid"/>
         <w:tblW w:w="14130" w:type="dxa"/>
         <w:tblInd w:w="-635" w:type="dxa"/>
         <w:tblLook w:val="04A0" w:firstRow="1" w:lastRow="0" w:firstColumn="1" w:lastColumn="0" w:noHBand="0" w:noVBand="1"/>
@@ -158,6 +158,7 @@
                 <w:lang w:bidi="th-TH"/>
               </w:rPr>
             </w:pPr>
+            <w:proofErr w:type="spellStart"/>
             <w:r>
               <w:rPr>
                 <w:rFonts w:ascii="TH SarabunPSK" w:hAnsi="TH SarabunPSK" w:cs="TH SarabunPSK"/>
@@ -167,6 +168,7 @@
               </w:rPr>
               <w:t>Painamnae</w:t>
             </w:r>
+            <w:proofErr w:type="spellEnd"/>
           </w:p>
         </w:tc>
       </w:tr>
@@ -404,6 +406,7 @@
               </w:rPr>
               <w:t xml:space="preserve">เว็บไซต์ </w:t>
             </w:r>
+            <w:proofErr w:type="spellStart"/>
             <w:r>
               <w:rPr>
                 <w:rFonts w:ascii="TH SarabunPSK" w:hAnsi="TH SarabunPSK" w:cs="TH SarabunPSK"/>
@@ -412,6 +415,7 @@
               </w:rPr>
               <w:t>Painamnae</w:t>
             </w:r>
+            <w:proofErr w:type="spellEnd"/>
           </w:p>
         </w:tc>
         <w:tc>
@@ -769,7 +773,27 @@
                 <w:szCs w:val="32"/>
                 <w:lang w:bidi="th-TH"/>
               </w:rPr>
-              <w:t>As an admin, I want keep the users updated on their reported incidents.</w:t>
+              <w:t xml:space="preserve">As an admin, I want </w:t>
+            </w:r>
+            <w:proofErr w:type="gramStart"/>
+            <w:r>
+              <w:rPr>
+                <w:rFonts w:ascii="TH SarabunPSK" w:hAnsi="TH SarabunPSK" w:cs="TH SarabunPSK"/>
+                <w:sz w:val="32"/>
+                <w:szCs w:val="32"/>
+                <w:lang w:bidi="th-TH"/>
+              </w:rPr>
+              <w:t>keep</w:t>
+            </w:r>
+            <w:proofErr w:type="gramEnd"/>
+            <w:r>
+              <w:rPr>
+                <w:rFonts w:ascii="TH SarabunPSK" w:hAnsi="TH SarabunPSK" w:cs="TH SarabunPSK"/>
+                <w:sz w:val="32"/>
+                <w:szCs w:val="32"/>
+                <w:lang w:bidi="th-TH"/>
+              </w:rPr>
+              <w:t xml:space="preserve"> the users updated on their reported incidents.</w:t>
             </w:r>
           </w:p>
         </w:tc>
@@ -1067,15 +1091,6 @@
                 <w:rFonts w:ascii="TH SarabunPSK" w:hAnsi="TH SarabunPSK" w:cs="TH SarabunPSK"/>
                 <w:sz w:val="32"/>
                 <w:szCs w:val="32"/>
-                <w:lang w:bidi="th-TH"/>
-              </w:rPr>
-              <w:t>1.</w:t>
-            </w:r>
-            <w:r>
-              <w:rPr>
-                <w:rFonts w:ascii="TH SarabunPSK" w:hAnsi="TH SarabunPSK" w:cs="TH SarabunPSK"/>
-                <w:sz w:val="32"/>
-                <w:szCs w:val="32"/>
                 <w:cs/>
                 <w:lang w:bidi="th-TH"/>
               </w:rPr>
@@ -1091,35 +1106,6 @@
               <w:t>Report Management</w:t>
             </w:r>
           </w:p>
-          <w:p>
-            <w:pPr>
-              <w:rPr>
-                <w:rFonts w:ascii="TH SarabunPSK" w:hAnsi="TH SarabunPSK" w:cs="TH SarabunPSK"/>
-                <w:sz w:val="32"/>
-                <w:szCs w:val="32"/>
-                <w:lang w:bidi="th-TH"/>
-              </w:rPr>
-            </w:pPr>
-            <w:r>
-              <w:rPr>
-                <w:rFonts w:ascii="TH SarabunPSK" w:hAnsi="TH SarabunPSK" w:cs="TH SarabunPSK"/>
-                <w:sz w:val="32"/>
-                <w:szCs w:val="32"/>
-                <w:lang w:bidi="th-TH"/>
-              </w:rPr>
-              <w:t>2.</w:t>
-            </w:r>
-            <w:r>
-              <w:rPr>
-                <w:rFonts w:ascii="TH SarabunPSK" w:hAnsi="TH SarabunPSK" w:cs="TH SarabunPSK"/>
-                <w:sz w:val="32"/>
-                <w:szCs w:val="32"/>
-                <w:cs/>
-                <w:lang w:bidi="th-TH"/>
-              </w:rPr>
-              <w:t>คลิกที่ไอคอนรูปดวงตา</w:t>
-            </w:r>
-          </w:p>
         </w:tc>
         <w:tc>
           <w:tcPr>
@@ -1131,26 +1117,39 @@
                 <w:rFonts w:ascii="TH SarabunPSK" w:hAnsi="TH SarabunPSK" w:cs="TH SarabunPSK"/>
                 <w:sz w:val="32"/>
                 <w:szCs w:val="32"/>
-              </w:rPr>
-            </w:pPr>
-            <w:r>
-              <w:rPr>
-                <w:rFonts w:ascii="TH SarabunPSK" w:hAnsi="TH SarabunPSK" w:cs="TH SarabunPSK"/>
-                <w:sz w:val="32"/>
-                <w:szCs w:val="32"/>
-                <w:lang w:bidi="th-TH"/>
-              </w:rPr>
-              <w:t>1.</w:t>
-            </w:r>
-            <w:r>
-              <w:rPr>
-                <w:rFonts w:ascii="TH SarabunPSK" w:hAnsi="TH SarabunPSK" w:cs="TH SarabunPSK"/>
-                <w:sz w:val="32"/>
-                <w:szCs w:val="32"/>
-                <w:cs/>
-                <w:lang w:bidi="th-TH"/>
-              </w:rPr>
-              <w:t xml:space="preserve">ไปหน้า </w:t>
+                <w:cs/>
+              </w:rPr>
+            </w:pPr>
+            <w:proofErr w:type="gramStart"/>
+            <w:r>
+              <w:rPr>
+                <w:rFonts w:ascii="TH SarabunPSK" w:hAnsi="TH SarabunPSK" w:cs="TH SarabunPSK"/>
+                <w:sz w:val="32"/>
+                <w:szCs w:val="32"/>
+                <w:lang w:bidi="th-TH"/>
+              </w:rPr>
+              <w:t>.</w:t>
+            </w:r>
+            <w:r>
+              <w:rPr>
+                <w:rFonts w:ascii="TH SarabunPSK" w:hAnsi="TH SarabunPSK" w:cs="TH SarabunPSK"/>
+                <w:sz w:val="32"/>
+                <w:szCs w:val="32"/>
+                <w:cs/>
+                <w:lang w:bidi="th-TH"/>
+              </w:rPr>
+              <w:t>ไปหน้า</w:t>
+            </w:r>
+            <w:proofErr w:type="gramEnd"/>
+            <w:r>
+              <w:rPr>
+                <w:rFonts w:ascii="TH SarabunPSK" w:hAnsi="TH SarabunPSK" w:cs="TH SarabunPSK"/>
+                <w:sz w:val="32"/>
+                <w:szCs w:val="32"/>
+                <w:cs/>
+                <w:lang w:bidi="th-TH"/>
+              </w:rPr>
+              <w:t xml:space="preserve"> </w:t>
             </w:r>
             <w:r>
               <w:rPr>
@@ -1159,35 +1158,6 @@
                 <w:szCs w:val="32"/>
               </w:rPr>
               <w:t>Report Management</w:t>
-            </w:r>
-          </w:p>
-          <w:p>
-            <w:pPr>
-              <w:rPr>
-                <w:rFonts w:ascii="TH SarabunPSK" w:hAnsi="TH SarabunPSK" w:cs="TH SarabunPSK"/>
-                <w:sz w:val="32"/>
-                <w:szCs w:val="32"/>
-                <w:cs/>
-                <w:lang w:bidi="th-TH"/>
-              </w:rPr>
-            </w:pPr>
-            <w:r>
-              <w:rPr>
-                <w:rFonts w:ascii="TH SarabunPSK" w:hAnsi="TH SarabunPSK" w:cs="TH SarabunPSK"/>
-                <w:sz w:val="32"/>
-                <w:szCs w:val="32"/>
-              </w:rPr>
-              <w:t>2.</w:t>
-            </w:r>
-            <w:r>
-              <w:rPr>
-                <w:rFonts w:ascii="TH SarabunPSK" w:hAnsi="TH SarabunPSK" w:cs="TH SarabunPSK"/>
-                <w:sz w:val="32"/>
-                <w:szCs w:val="32"/>
-                <w:cs/>
-                <w:lang w:bidi="th-TH"/>
-              </w:rPr>
-              <w:t>ไปหน้ารายละเอียดการรายงานผู้ขับขี่ และมีข้อมูลแสดงผลครบถ้วน</w:t>
             </w:r>
           </w:p>
         </w:tc>
@@ -1209,15 +1179,6 @@
                 <w:rFonts w:ascii="TH SarabunPSK" w:hAnsi="TH SarabunPSK" w:cs="TH SarabunPSK"/>
                 <w:sz w:val="32"/>
                 <w:szCs w:val="32"/>
-                <w:lang w:bidi="th-TH"/>
-              </w:rPr>
-              <w:t>1.</w:t>
-            </w:r>
-            <w:r>
-              <w:rPr>
-                <w:rFonts w:ascii="TH SarabunPSK" w:hAnsi="TH SarabunPSK" w:cs="TH SarabunPSK"/>
-                <w:sz w:val="32"/>
-                <w:szCs w:val="32"/>
                 <w:cs/>
                 <w:lang w:bidi="th-TH"/>
               </w:rPr>
@@ -1232,41 +1193,15 @@
               <w:t>Report Management</w:t>
             </w:r>
           </w:p>
-          <w:p>
-            <w:pPr>
-              <w:rPr>
-                <w:rFonts w:ascii="TH SarabunPSK" w:hAnsi="TH SarabunPSK" w:cs="TH SarabunPSK"/>
-                <w:sz w:val="32"/>
-                <w:szCs w:val="32"/>
-                <w:lang w:bidi="th-TH"/>
-              </w:rPr>
-            </w:pPr>
-            <w:r>
-              <w:rPr>
-                <w:rFonts w:ascii="TH SarabunPSK" w:hAnsi="TH SarabunPSK" w:cs="TH SarabunPSK"/>
-                <w:sz w:val="32"/>
-                <w:szCs w:val="32"/>
-              </w:rPr>
-              <w:t>2.</w:t>
-            </w:r>
-            <w:r>
-              <w:rPr>
-                <w:rFonts w:ascii="TH SarabunPSK" w:hAnsi="TH SarabunPSK" w:cs="TH SarabunPSK"/>
-                <w:sz w:val="32"/>
-                <w:szCs w:val="32"/>
-                <w:cs/>
-                <w:lang w:bidi="th-TH"/>
-              </w:rPr>
-              <w:t>อยู่หน้ารายละเอียดการรายงานผู้ขับขี่ และมีข้อมูลแสดงผลครบถ้วน</w:t>
-            </w:r>
-          </w:p>
         </w:tc>
         <w:tc>
           <w:tcPr>
             <w:tcW w:w="2279" w:type="dxa"/>
-          </w:tcPr>
-          <w:p>
-            <w:pPr>
+            <w:vAlign w:val="center"/>
+          </w:tcPr>
+          <w:p>
+            <w:pPr>
+              <w:jc w:val="center"/>
               <w:rPr>
                 <w:rFonts w:ascii="TH SarabunPSK" w:hAnsi="TH SarabunPSK" w:cs="TH SarabunPSK"/>
                 <w:sz w:val="32"/>
@@ -1312,15 +1247,15 @@
             <w:pPr>
               <w:jc w:val="center"/>
               <w:rPr>
-                <w:rFonts w:ascii="TH SarabunPSK" w:hAnsi="TH SarabunPSK" w:cs="TH SarabunPSK"/>
-                <w:sz w:val="32"/>
-                <w:szCs w:val="32"/>
-                <w:lang w:bidi="th-TH"/>
-              </w:rPr>
-            </w:pPr>
-            <w:r>
-              <w:rPr>
-                <w:rFonts w:ascii="TH SarabunPSK" w:hAnsi="TH SarabunPSK" w:cs="TH SarabunPSK" w:hint="cs"/>
+                <w:rFonts w:ascii="TH SarabunPSK" w:hAnsi="TH SarabunPSK" w:cs="TH SarabunPSK" w:hint="cs"/>
+                <w:sz w:val="32"/>
+                <w:szCs w:val="32"/>
+                <w:lang w:bidi="th-TH"/>
+              </w:rPr>
+            </w:pPr>
+            <w:r>
+              <w:rPr>
+                <w:rFonts w:ascii="TH SarabunPSK" w:hAnsi="TH SarabunPSK" w:cs="TH SarabunPSK"/>
                 <w:sz w:val="32"/>
                 <w:szCs w:val="32"/>
                 <w:lang w:bidi="th-TH"/>
@@ -1351,36 +1286,7 @@
                 <w:cs/>
                 <w:lang w:bidi="th-TH"/>
               </w:rPr>
-              <w:t>1. อยู่หน้ารายละเอียดการรายงานผู้ขับขี่</w:t>
-            </w:r>
-          </w:p>
-          <w:p>
-            <w:pPr>
-              <w:rPr>
-                <w:rFonts w:ascii="TH SarabunPSK" w:hAnsi="TH SarabunPSK" w:cs="TH SarabunPSK"/>
-                <w:sz w:val="32"/>
-                <w:szCs w:val="32"/>
-                <w:lang w:bidi="th-TH"/>
-              </w:rPr>
-            </w:pPr>
-            <w:r>
-              <w:rPr>
-                <w:rFonts w:ascii="TH SarabunPSK" w:hAnsi="TH SarabunPSK" w:cs="TH SarabunPSK"/>
-                <w:sz w:val="32"/>
-                <w:szCs w:val="32"/>
-                <w:lang w:bidi="th-TH"/>
-              </w:rPr>
-              <w:t>2.</w:t>
-            </w:r>
-            <w:r>
-              <w:rPr>
-                <w:rFonts w:ascii="TH SarabunPSK" w:hAnsi="TH SarabunPSK" w:cs="TH SarabunPSK"/>
-                <w:sz w:val="32"/>
-                <w:szCs w:val="32"/>
-                <w:cs/>
-                <w:lang w:bidi="th-TH"/>
-              </w:rPr>
-              <w:t>กดย้อนกลับ</w:t>
+              <w:t>คลิกที่ไอคอนรูปดวงตา</w:t>
             </w:r>
           </w:p>
         </w:tc>
@@ -1405,15 +1311,7 @@
                 <w:cs/>
                 <w:lang w:bidi="th-TH"/>
               </w:rPr>
-              <w:t xml:space="preserve">อยู่หน้า </w:t>
-            </w:r>
-            <w:r>
-              <w:rPr>
-                <w:rFonts w:ascii="TH SarabunPSK" w:hAnsi="TH SarabunPSK" w:cs="TH SarabunPSK"/>
-                <w:sz w:val="32"/>
-                <w:szCs w:val="32"/>
-              </w:rPr>
-              <w:t>Report Management</w:t>
+              <w:t>ไปหน้ารายละเอียดการรายงานผู้ขับขี่ และมีข้อมูลแสดงผลครบถ้วน</w:t>
             </w:r>
           </w:p>
         </w:tc>
@@ -1439,34 +1337,30 @@
                 <w:cs/>
                 <w:lang w:bidi="th-TH"/>
               </w:rPr>
-              <w:t xml:space="preserve">อยู่หน้า </w:t>
-            </w:r>
-            <w:r>
-              <w:rPr>
-                <w:rFonts w:ascii="TH SarabunPSK" w:hAnsi="TH SarabunPSK" w:cs="TH SarabunPSK"/>
-                <w:sz w:val="32"/>
-                <w:szCs w:val="32"/>
-              </w:rPr>
-              <w:t>Report Management</w:t>
+              <w:t>อยู่หน้ารายละเอียดการรายงานผู้ขับขี่ และมีข้อมูลแสดงผลครบถ้วน</w:t>
             </w:r>
           </w:p>
         </w:tc>
         <w:tc>
           <w:tcPr>
             <w:tcW w:w="2279" w:type="dxa"/>
-          </w:tcPr>
-          <w:p>
-            <w:pPr>
-              <w:rPr>
-                <w:rFonts w:ascii="TH SarabunPSK" w:hAnsi="TH SarabunPSK" w:cs="TH SarabunPSK"/>
-                <w:sz w:val="32"/>
-                <w:szCs w:val="32"/>
-                <w:lang w:bidi="th-TH"/>
-              </w:rPr>
-            </w:pPr>
-            <w:r>
-              <w:rPr>
-                <w:rFonts w:ascii="TH SarabunPSK" w:hAnsi="TH SarabunPSK" w:cs="TH SarabunPSK" w:hint="cs"/>
+            <w:vAlign w:val="center"/>
+          </w:tcPr>
+          <w:p>
+            <w:pPr>
+              <w:jc w:val="center"/>
+              <w:rPr>
+                <w:rFonts w:ascii="TH SarabunPSK" w:hAnsi="TH SarabunPSK" w:cs="TH SarabunPSK"/>
+                <w:b/>
+                <w:bCs/>
+                <w:sz w:val="32"/>
+                <w:szCs w:val="32"/>
+                <w:lang w:bidi="th-TH"/>
+              </w:rPr>
+            </w:pPr>
+            <w:r>
+              <w:rPr>
+                <w:rFonts w:ascii="TH SarabunPSK" w:hAnsi="TH SarabunPSK" w:cs="TH SarabunPSK"/>
                 <w:b/>
                 <w:bCs/>
                 <w:sz w:val="32"/>
@@ -1502,20 +1396,34 @@
             <w:pPr>
               <w:jc w:val="center"/>
               <w:rPr>
-                <w:rFonts w:ascii="TH SarabunPSK" w:hAnsi="TH SarabunPSK" w:cs="TH SarabunPSK"/>
-                <w:sz w:val="32"/>
-                <w:szCs w:val="32"/>
-                <w:lang w:bidi="th-TH"/>
-              </w:rPr>
-            </w:pPr>
-            <w:r>
-              <w:rPr>
-                <w:rFonts w:ascii="TH SarabunPSK" w:hAnsi="TH SarabunPSK" w:cs="TH SarabunPSK"/>
-                <w:sz w:val="32"/>
-                <w:szCs w:val="32"/>
-                <w:lang w:bidi="th-TH"/>
-              </w:rPr>
-              <w:t>3</w:t>
+                <w:rFonts w:ascii="TH SarabunPSK" w:hAnsi="TH SarabunPSK" w:cs="TH SarabunPSK" w:hint="cs"/>
+                <w:sz w:val="32"/>
+                <w:szCs w:val="32"/>
+                <w:lang w:bidi="th-TH"/>
+              </w:rPr>
+            </w:pPr>
+            <w:r>
+              <w:rPr>
+                <w:rFonts w:ascii="TH SarabunPSK" w:hAnsi="TH SarabunPSK" w:cs="TH SarabunPSK" w:hint="cs"/>
+                <w:b/>
+                <w:bCs/>
+                <w:sz w:val="32"/>
+                <w:szCs w:val="32"/>
+                <w:lang w:bidi="th-TH"/>
+              </w:rPr>
+              <w:t>No</w:t>
+            </w:r>
+            <w:r>
+              <w:rPr>
+                <w:rFonts w:ascii="TH SarabunPSK" w:hAnsi="TH SarabunPSK" w:cs="TH SarabunPSK" w:hint="cs"/>
+                <w:b/>
+                <w:bCs/>
+                <w:sz w:val="32"/>
+                <w:szCs w:val="32"/>
+                <w:cs/>
+                <w:lang w:bidi="th-TH"/>
+              </w:rPr>
+              <w:t>.</w:t>
             </w:r>
           </w:p>
         </w:tc>
@@ -1530,65 +1438,20 @@
                 <w:rFonts w:ascii="TH SarabunPSK" w:hAnsi="TH SarabunPSK" w:cs="TH SarabunPSK"/>
                 <w:sz w:val="32"/>
                 <w:szCs w:val="32"/>
-                <w:lang w:bidi="th-TH"/>
-              </w:rPr>
-            </w:pPr>
-            <w:r>
-              <w:rPr>
-                <w:rFonts w:ascii="TH SarabunPSK" w:hAnsi="TH SarabunPSK" w:cs="TH SarabunPSK"/>
-                <w:sz w:val="32"/>
-                <w:szCs w:val="32"/>
-                <w:lang w:bidi="th-TH"/>
-              </w:rPr>
-              <w:t xml:space="preserve">1. </w:t>
-            </w:r>
-            <w:r>
-              <w:rPr>
-                <w:rFonts w:ascii="TH SarabunPSK" w:hAnsi="TH SarabunPSK" w:cs="TH SarabunPSK"/>
-                <w:sz w:val="32"/>
-                <w:szCs w:val="32"/>
-                <w:cs/>
-                <w:lang w:bidi="th-TH"/>
-              </w:rPr>
-              <w:t>อยู่หน้ารายละเอียดการรายงานผู้ขับขี่</w:t>
-            </w:r>
-          </w:p>
-          <w:p>
-            <w:pPr>
-              <w:rPr>
-                <w:rFonts w:ascii="TH SarabunPSK" w:hAnsi="TH SarabunPSK" w:cs="TH SarabunPSK"/>
-                <w:sz w:val="32"/>
-                <w:szCs w:val="32"/>
-                <w:lang w:bidi="th-TH"/>
-              </w:rPr>
-            </w:pPr>
-            <w:r>
-              <w:rPr>
-                <w:rFonts w:ascii="TH SarabunPSK" w:hAnsi="TH SarabunPSK" w:cs="TH SarabunPSK"/>
-                <w:sz w:val="32"/>
-                <w:szCs w:val="32"/>
-                <w:lang w:bidi="th-TH"/>
-              </w:rPr>
-              <w:t>2.</w:t>
-            </w:r>
-            <w:r>
-              <w:rPr>
-                <w:rFonts w:ascii="TH SarabunPSK" w:hAnsi="TH SarabunPSK" w:cs="TH SarabunPSK"/>
-                <w:sz w:val="32"/>
-                <w:szCs w:val="32"/>
-                <w:cs/>
-                <w:lang w:bidi="th-TH"/>
-              </w:rPr>
-              <w:t xml:space="preserve">กดเปลี่ยนสถานะเป็น </w:t>
-            </w:r>
-            <w:r>
-              <w:rPr>
-                <w:rFonts w:ascii="TH SarabunPSK" w:hAnsi="TH SarabunPSK" w:cs="TH SarabunPSK"/>
-                <w:sz w:val="32"/>
-                <w:szCs w:val="32"/>
-                <w:lang w:bidi="th-TH"/>
-              </w:rPr>
-              <w:t>approve</w:t>
+                <w:cs/>
+                <w:lang w:bidi="th-TH"/>
+              </w:rPr>
+            </w:pPr>
+            <w:r>
+              <w:rPr>
+                <w:rFonts w:ascii="TH SarabunPSK" w:hAnsi="TH SarabunPSK" w:cs="TH SarabunPSK" w:hint="cs"/>
+                <w:b/>
+                <w:bCs/>
+                <w:sz w:val="32"/>
+                <w:szCs w:val="32"/>
+                <w:lang w:bidi="th-TH"/>
+              </w:rPr>
+              <w:t>Test Case and Steps</w:t>
             </w:r>
           </w:p>
         </w:tc>
@@ -1608,21 +1471,14 @@
             </w:pPr>
             <w:r>
               <w:rPr>
-                <w:rFonts w:ascii="TH SarabunPSK" w:hAnsi="TH SarabunPSK" w:cs="TH SarabunPSK"/>
-                <w:sz w:val="32"/>
-                <w:szCs w:val="32"/>
-                <w:cs/>
-                <w:lang w:bidi="th-TH"/>
-              </w:rPr>
-              <w:t xml:space="preserve">สถานะคำร้องที่เลือกเปลี่ยนเป็น </w:t>
-            </w:r>
-            <w:r>
-              <w:rPr>
-                <w:rFonts w:ascii="TH SarabunPSK" w:hAnsi="TH SarabunPSK" w:cs="TH SarabunPSK"/>
-                <w:sz w:val="32"/>
-                <w:szCs w:val="32"/>
-              </w:rPr>
-              <w:t>approve</w:t>
+                <w:rFonts w:ascii="TH SarabunPSK" w:hAnsi="TH SarabunPSK" w:cs="TH SarabunPSK" w:hint="cs"/>
+                <w:b/>
+                <w:bCs/>
+                <w:sz w:val="32"/>
+                <w:szCs w:val="32"/>
+                <w:lang w:bidi="th-TH"/>
+              </w:rPr>
+              <w:t>Expected Result</w:t>
             </w:r>
           </w:p>
         </w:tc>
@@ -1637,26 +1493,20 @@
                 <w:rFonts w:ascii="TH SarabunPSK" w:hAnsi="TH SarabunPSK" w:cs="TH SarabunPSK"/>
                 <w:sz w:val="32"/>
                 <w:szCs w:val="32"/>
-                <w:lang w:bidi="th-TH"/>
-              </w:rPr>
-            </w:pPr>
-            <w:r>
-              <w:rPr>
-                <w:rFonts w:ascii="TH SarabunPSK" w:hAnsi="TH SarabunPSK" w:cs="TH SarabunPSK"/>
-                <w:sz w:val="32"/>
-                <w:szCs w:val="32"/>
-                <w:cs/>
-                <w:lang w:bidi="th-TH"/>
-              </w:rPr>
-              <w:t xml:space="preserve">สถานะคำร้องที่เลือกเปลี่ยนเป็น </w:t>
-            </w:r>
-            <w:r>
-              <w:rPr>
-                <w:rFonts w:ascii="TH SarabunPSK" w:hAnsi="TH SarabunPSK" w:cs="TH SarabunPSK"/>
-                <w:sz w:val="32"/>
-                <w:szCs w:val="32"/>
-              </w:rPr>
-              <w:t>approve</w:t>
+                <w:cs/>
+                <w:lang w:bidi="th-TH"/>
+              </w:rPr>
+            </w:pPr>
+            <w:r>
+              <w:rPr>
+                <w:rFonts w:ascii="TH SarabunPSK" w:hAnsi="TH SarabunPSK" w:cs="TH SarabunPSK" w:hint="cs"/>
+                <w:b/>
+                <w:bCs/>
+                <w:sz w:val="32"/>
+                <w:szCs w:val="32"/>
+                <w:lang w:bidi="th-TH"/>
+              </w:rPr>
+              <w:t>Actual Result</w:t>
             </w:r>
           </w:p>
         </w:tc>
@@ -1667,12 +1517,37 @@
           <w:p>
             <w:pPr>
               <w:rPr>
-                <w:rFonts w:ascii="TH SarabunPSK" w:hAnsi="TH SarabunPSK" w:cs="TH SarabunPSK"/>
-                <w:sz w:val="32"/>
-                <w:szCs w:val="32"/>
-                <w:lang w:bidi="th-TH"/>
-              </w:rPr>
-            </w:pPr>
+                <w:rFonts w:ascii="TH SarabunPSK" w:hAnsi="TH SarabunPSK" w:cs="TH SarabunPSK" w:hint="cs"/>
+                <w:b/>
+                <w:bCs/>
+                <w:sz w:val="32"/>
+                <w:szCs w:val="32"/>
+                <w:lang w:bidi="th-TH"/>
+              </w:rPr>
+            </w:pPr>
+            <w:r>
+              <w:rPr>
+                <w:rFonts w:ascii="TH SarabunPSK" w:hAnsi="TH SarabunPSK" w:cs="TH SarabunPSK" w:hint="cs"/>
+                <w:b/>
+                <w:bCs/>
+                <w:sz w:val="32"/>
+                <w:szCs w:val="32"/>
+                <w:lang w:bidi="th-TH"/>
+              </w:rPr>
+              <w:t xml:space="preserve">Test Result </w:t>
+            </w:r>
+            <w:r>
+              <w:rPr>
+                <w:rFonts w:ascii="TH SarabunPSK" w:hAnsi="TH SarabunPSK" w:cs="TH SarabunPSK" w:hint="cs"/>
+                <w:b/>
+                <w:bCs/>
+                <w:sz w:val="32"/>
+                <w:szCs w:val="32"/>
+                <w:cs/>
+                <w:lang w:bidi="th-TH"/>
+              </w:rPr>
+              <w:t>(</w:t>
+            </w:r>
             <w:r>
               <w:rPr>
                 <w:rFonts w:ascii="TH SarabunPSK" w:hAnsi="TH SarabunPSK" w:cs="TH SarabunPSK" w:hint="cs"/>
@@ -1684,6 +1559,41 @@
               </w:rPr>
               <w:t>Pass</w:t>
             </w:r>
+            <w:r>
+              <w:rPr>
+                <w:rFonts w:ascii="TH SarabunPSK" w:hAnsi="TH SarabunPSK" w:cs="TH SarabunPSK" w:hint="cs"/>
+                <w:b/>
+                <w:bCs/>
+                <w:sz w:val="32"/>
+                <w:szCs w:val="32"/>
+                <w:cs/>
+                <w:lang w:bidi="th-TH"/>
+              </w:rPr>
+              <w:t>/</w:t>
+            </w:r>
+            <w:r>
+              <w:rPr>
+                <w:rFonts w:ascii="TH SarabunPSK" w:hAnsi="TH SarabunPSK" w:cs="TH SarabunPSK" w:hint="cs"/>
+                <w:b/>
+                <w:bCs/>
+                <w:sz w:val="32"/>
+                <w:szCs w:val="32"/>
+                <w:lang w:bidi="th-TH"/>
+              </w:rPr>
+              <w:t>Fail</w:t>
+            </w:r>
+            <w:r>
+              <w:rPr>
+                <w:rFonts w:ascii="TH SarabunPSK" w:hAnsi="TH SarabunPSK" w:cs="TH SarabunPSK" w:hint="cs"/>
+                <w:b/>
+                <w:bCs/>
+                <w:sz w:val="32"/>
+                <w:szCs w:val="32"/>
+                <w:cs/>
+                <w:lang w:bidi="th-TH"/>
+              </w:rPr>
+              <w:t>)</w:t>
+            </w:r>
           </w:p>
         </w:tc>
         <w:tc>
@@ -1692,13 +1602,25 @@
           </w:tcPr>
           <w:p>
             <w:pPr>
-              <w:rPr>
-                <w:rFonts w:ascii="TH SarabunPSK" w:hAnsi="TH SarabunPSK" w:cs="TH SarabunPSK"/>
-                <w:sz w:val="32"/>
-                <w:szCs w:val="32"/>
-                <w:lang w:bidi="th-TH"/>
-              </w:rPr>
-            </w:pPr>
+              <w:jc w:val="center"/>
+              <w:rPr>
+                <w:rFonts w:ascii="TH SarabunPSK" w:hAnsi="TH SarabunPSK" w:cs="TH SarabunPSK"/>
+                <w:sz w:val="32"/>
+                <w:szCs w:val="32"/>
+                <w:lang w:bidi="th-TH"/>
+              </w:rPr>
+            </w:pPr>
+            <w:r>
+              <w:rPr>
+                <w:rFonts w:ascii="TH SarabunPSK" w:hAnsi="TH SarabunPSK" w:cs="TH SarabunPSK" w:hint="cs"/>
+                <w:b/>
+                <w:bCs/>
+                <w:sz w:val="32"/>
+                <w:szCs w:val="32"/>
+                <w:lang w:bidi="th-TH"/>
+              </w:rPr>
+              <w:t>Remark</w:t>
+            </w:r>
           </w:p>
         </w:tc>
       </w:tr>
@@ -1724,7 +1646,7 @@
                 <w:szCs w:val="32"/>
                 <w:lang w:bidi="th-TH"/>
               </w:rPr>
-              <w:t>4</w:t>
+              <w:t>1</w:t>
             </w:r>
           </w:p>
         </w:tc>
@@ -1747,15 +1669,6 @@
                 <w:rFonts w:ascii="TH SarabunPSK" w:hAnsi="TH SarabunPSK" w:cs="TH SarabunPSK"/>
                 <w:sz w:val="32"/>
                 <w:szCs w:val="32"/>
-                <w:lang w:bidi="th-TH"/>
-              </w:rPr>
-              <w:t xml:space="preserve">1. </w:t>
-            </w:r>
-            <w:r>
-              <w:rPr>
-                <w:rFonts w:ascii="TH SarabunPSK" w:hAnsi="TH SarabunPSK" w:cs="TH SarabunPSK"/>
-                <w:sz w:val="32"/>
-                <w:szCs w:val="32"/>
                 <w:cs/>
                 <w:lang w:bidi="th-TH"/>
               </w:rPr>
@@ -1771,34 +1684,6 @@
                 <w:lang w:bidi="th-TH"/>
               </w:rPr>
             </w:pPr>
-            <w:r>
-              <w:rPr>
-                <w:rFonts w:ascii="TH SarabunPSK" w:hAnsi="TH SarabunPSK" w:cs="TH SarabunPSK"/>
-                <w:sz w:val="32"/>
-                <w:szCs w:val="32"/>
-                <w:lang w:bidi="th-TH"/>
-              </w:rPr>
-              <w:t>2.</w:t>
-            </w:r>
-            <w:r>
-              <w:rPr>
-                <w:rFonts w:ascii="TH SarabunPSK" w:hAnsi="TH SarabunPSK" w:cs="TH SarabunPSK"/>
-                <w:sz w:val="32"/>
-                <w:szCs w:val="32"/>
-                <w:cs/>
-                <w:lang w:bidi="th-TH"/>
-              </w:rPr>
-              <w:t xml:space="preserve">กดเปลี่ยนสถานะเป็น </w:t>
-            </w:r>
-            <w:r>
-              <w:rPr>
-                <w:rFonts w:ascii="TH SarabunPSK" w:hAnsi="TH SarabunPSK" w:cs="TH SarabunPSK"/>
-                <w:sz w:val="32"/>
-                <w:szCs w:val="32"/>
-                <w:lang w:bidi="th-TH"/>
-              </w:rPr>
-              <w:t>reject</w:t>
-            </w:r>
           </w:p>
         </w:tc>
         <w:tc>
@@ -1807,30 +1692,22 @@
           </w:tcPr>
           <w:p>
             <w:pPr>
-              <w:rPr>
-                <w:rFonts w:ascii="TH SarabunPSK" w:hAnsi="TH SarabunPSK" w:cs="TH SarabunPSK"/>
-                <w:sz w:val="32"/>
-                <w:szCs w:val="32"/>
-                <w:lang w:bidi="th-TH"/>
-              </w:rPr>
-            </w:pPr>
-            <w:r>
-              <w:rPr>
-                <w:rFonts w:ascii="TH SarabunPSK" w:hAnsi="TH SarabunPSK" w:cs="TH SarabunPSK"/>
-                <w:sz w:val="32"/>
-                <w:szCs w:val="32"/>
-                <w:cs/>
-                <w:lang w:bidi="th-TH"/>
-              </w:rPr>
-              <w:t xml:space="preserve">สถานะคำร้องที่เลือกเปลี่ยนเป็น </w:t>
-            </w:r>
-            <w:r>
-              <w:rPr>
-                <w:rFonts w:ascii="TH SarabunPSK" w:hAnsi="TH SarabunPSK" w:cs="TH SarabunPSK"/>
-                <w:sz w:val="32"/>
-                <w:szCs w:val="32"/>
-              </w:rPr>
-              <w:t>reject</w:t>
+              <w:jc w:val="center"/>
+              <w:rPr>
+                <w:rFonts w:ascii="TH SarabunPSK" w:hAnsi="TH SarabunPSK" w:cs="TH SarabunPSK"/>
+                <w:sz w:val="32"/>
+                <w:szCs w:val="32"/>
+                <w:lang w:bidi="th-TH"/>
+              </w:rPr>
+            </w:pPr>
+            <w:r>
+              <w:rPr>
+                <w:rFonts w:ascii="TH SarabunPSK" w:hAnsi="TH SarabunPSK" w:cs="TH SarabunPSK"/>
+                <w:sz w:val="32"/>
+                <w:szCs w:val="32"/>
+                <w:lang w:bidi="th-TH"/>
+              </w:rPr>
+              <w:t>-</w:t>
             </w:r>
           </w:p>
         </w:tc>
@@ -1841,10 +1718,754 @@
           </w:tcPr>
           <w:p>
             <w:pPr>
-              <w:rPr>
-                <w:rFonts w:ascii="TH SarabunPSK" w:hAnsi="TH SarabunPSK" w:cs="TH SarabunPSK"/>
-                <w:sz w:val="32"/>
-                <w:szCs w:val="32"/>
+              <w:jc w:val="center"/>
+              <w:rPr>
+                <w:rFonts w:ascii="TH SarabunPSK" w:hAnsi="TH SarabunPSK" w:cs="TH SarabunPSK"/>
+                <w:sz w:val="32"/>
+                <w:szCs w:val="32"/>
+                <w:lang w:bidi="th-TH"/>
+              </w:rPr>
+            </w:pPr>
+            <w:r>
+              <w:rPr>
+                <w:rFonts w:ascii="TH SarabunPSK" w:hAnsi="TH SarabunPSK" w:cs="TH SarabunPSK"/>
+                <w:sz w:val="32"/>
+                <w:szCs w:val="32"/>
+                <w:lang w:bidi="th-TH"/>
+              </w:rPr>
+              <w:t>-</w:t>
+            </w:r>
+          </w:p>
+        </w:tc>
+        <w:tc>
+          <w:tcPr>
+            <w:tcW w:w="2279" w:type="dxa"/>
+            <w:vMerge w:val="restart"/>
+            <w:vAlign w:val="center"/>
+          </w:tcPr>
+          <w:p>
+            <w:pPr>
+              <w:jc w:val="center"/>
+              <w:rPr>
+                <w:rFonts w:ascii="TH SarabunPSK" w:hAnsi="TH SarabunPSK" w:cs="TH SarabunPSK"/>
+                <w:b/>
+                <w:bCs/>
+                <w:sz w:val="32"/>
+                <w:szCs w:val="32"/>
+                <w:lang w:bidi="th-TH"/>
+              </w:rPr>
+            </w:pPr>
+            <w:r>
+              <w:rPr>
+                <w:rFonts w:ascii="TH SarabunPSK" w:hAnsi="TH SarabunPSK" w:cs="TH SarabunPSK" w:hint="cs"/>
+                <w:b/>
+                <w:bCs/>
+                <w:sz w:val="32"/>
+                <w:szCs w:val="32"/>
+                <w:lang w:bidi="th-TH"/>
+              </w:rPr>
+              <w:t>Pass</w:t>
+            </w:r>
+          </w:p>
+          <w:p>
+            <w:pPr>
+              <w:jc w:val="center"/>
+              <w:rPr>
+                <w:rFonts w:ascii="TH SarabunPSK" w:hAnsi="TH SarabunPSK" w:cs="TH SarabunPSK"/>
+                <w:b/>
+                <w:bCs/>
+                <w:sz w:val="32"/>
+                <w:szCs w:val="32"/>
+                <w:lang w:bidi="th-TH"/>
+              </w:rPr>
+            </w:pPr>
+          </w:p>
+          <w:p>
+            <w:pPr>
+              <w:jc w:val="center"/>
+              <w:rPr>
+                <w:rFonts w:ascii="TH SarabunPSK" w:hAnsi="TH SarabunPSK" w:cs="TH SarabunPSK"/>
+                <w:b/>
+                <w:bCs/>
+                <w:sz w:val="32"/>
+                <w:szCs w:val="32"/>
+                <w:lang w:bidi="th-TH"/>
+              </w:rPr>
+            </w:pPr>
+          </w:p>
+          <w:p>
+            <w:pPr>
+              <w:jc w:val="center"/>
+              <w:rPr>
+                <w:rFonts w:ascii="TH SarabunPSK" w:hAnsi="TH SarabunPSK" w:cs="TH SarabunPSK"/>
+                <w:b/>
+                <w:bCs/>
+                <w:sz w:val="32"/>
+                <w:szCs w:val="32"/>
+                <w:lang w:bidi="th-TH"/>
+              </w:rPr>
+            </w:pPr>
+          </w:p>
+          <w:p>
+            <w:pPr>
+              <w:jc w:val="center"/>
+              <w:rPr>
+                <w:rFonts w:ascii="TH SarabunPSK" w:hAnsi="TH SarabunPSK" w:cs="TH SarabunPSK"/>
+                <w:b/>
+                <w:bCs/>
+                <w:sz w:val="32"/>
+                <w:szCs w:val="32"/>
+                <w:lang w:bidi="th-TH"/>
+              </w:rPr>
+            </w:pPr>
+          </w:p>
+          <w:p>
+            <w:pPr>
+              <w:jc w:val="center"/>
+              <w:rPr>
+                <w:rFonts w:ascii="TH SarabunPSK" w:hAnsi="TH SarabunPSK" w:cs="TH SarabunPSK"/>
+                <w:b/>
+                <w:bCs/>
+                <w:sz w:val="32"/>
+                <w:szCs w:val="32"/>
+                <w:lang w:bidi="th-TH"/>
+              </w:rPr>
+            </w:pPr>
+          </w:p>
+          <w:p>
+            <w:pPr>
+              <w:jc w:val="center"/>
+              <w:rPr>
+                <w:rFonts w:ascii="TH SarabunPSK" w:hAnsi="TH SarabunPSK" w:cs="TH SarabunPSK"/>
+                <w:sz w:val="32"/>
+                <w:szCs w:val="32"/>
+                <w:lang w:bidi="th-TH"/>
+              </w:rPr>
+            </w:pPr>
+          </w:p>
+        </w:tc>
+        <w:tc>
+          <w:tcPr>
+            <w:tcW w:w="1352" w:type="dxa"/>
+            <w:vMerge w:val="restart"/>
+          </w:tcPr>
+          <w:p>
+            <w:pPr>
+              <w:rPr>
+                <w:rFonts w:ascii="TH SarabunPSK" w:hAnsi="TH SarabunPSK" w:cs="TH SarabunPSK"/>
+                <w:sz w:val="32"/>
+                <w:szCs w:val="32"/>
+                <w:lang w:bidi="th-TH"/>
+              </w:rPr>
+            </w:pPr>
+          </w:p>
+        </w:tc>
+      </w:tr>
+      <w:tr>
+        <w:tc>
+          <w:tcPr>
+            <w:tcW w:w="630" w:type="dxa"/>
+          </w:tcPr>
+          <w:p>
+            <w:pPr>
+              <w:jc w:val="center"/>
+              <w:rPr>
+                <w:rFonts w:ascii="TH SarabunPSK" w:hAnsi="TH SarabunPSK" w:cs="TH SarabunPSK" w:hint="cs"/>
+                <w:b/>
+                <w:bCs/>
+                <w:sz w:val="32"/>
+                <w:szCs w:val="32"/>
+                <w:lang w:bidi="th-TH"/>
+              </w:rPr>
+            </w:pPr>
+            <w:r>
+              <w:rPr>
+                <w:rFonts w:ascii="TH SarabunPSK" w:hAnsi="TH SarabunPSK" w:cs="TH SarabunPSK"/>
+                <w:b/>
+                <w:bCs/>
+                <w:sz w:val="32"/>
+                <w:szCs w:val="32"/>
+                <w:lang w:bidi="th-TH"/>
+              </w:rPr>
+              <w:t>2</w:t>
+            </w:r>
+          </w:p>
+        </w:tc>
+        <w:tc>
+          <w:tcPr>
+            <w:tcW w:w="4507" w:type="dxa"/>
+            <w:gridSpan w:val="2"/>
+          </w:tcPr>
+          <w:p>
+            <w:pPr>
+              <w:rPr>
+                <w:rFonts w:ascii="TH SarabunPSK" w:hAnsi="TH SarabunPSK" w:cs="TH SarabunPSK" w:hint="cs"/>
+                <w:b/>
+                <w:bCs/>
+                <w:sz w:val="32"/>
+                <w:szCs w:val="32"/>
+                <w:lang w:bidi="th-TH"/>
+              </w:rPr>
+            </w:pPr>
+            <w:r>
+              <w:rPr>
+                <w:rFonts w:ascii="TH SarabunPSK" w:hAnsi="TH SarabunPSK" w:cs="TH SarabunPSK"/>
+                <w:sz w:val="32"/>
+                <w:szCs w:val="32"/>
+                <w:cs/>
+                <w:lang w:bidi="th-TH"/>
+              </w:rPr>
+              <w:t>กดย้อนกลับ</w:t>
+            </w:r>
+          </w:p>
+        </w:tc>
+        <w:tc>
+          <w:tcPr>
+            <w:tcW w:w="2759" w:type="dxa"/>
+          </w:tcPr>
+          <w:p>
+            <w:pPr>
+              <w:rPr>
+                <w:rFonts w:ascii="TH SarabunPSK" w:hAnsi="TH SarabunPSK" w:cs="TH SarabunPSK" w:hint="cs"/>
+                <w:b/>
+                <w:bCs/>
+                <w:sz w:val="32"/>
+                <w:szCs w:val="32"/>
+                <w:lang w:bidi="th-TH"/>
+              </w:rPr>
+            </w:pPr>
+            <w:r>
+              <w:rPr>
+                <w:rFonts w:ascii="TH SarabunPSK" w:hAnsi="TH SarabunPSK" w:cs="TH SarabunPSK"/>
+                <w:sz w:val="32"/>
+                <w:szCs w:val="32"/>
+                <w:cs/>
+                <w:lang w:bidi="th-TH"/>
+              </w:rPr>
+              <w:t xml:space="preserve">อยู่หน้า </w:t>
+            </w:r>
+            <w:r>
+              <w:rPr>
+                <w:rFonts w:ascii="TH SarabunPSK" w:hAnsi="TH SarabunPSK" w:cs="TH SarabunPSK"/>
+                <w:sz w:val="32"/>
+                <w:szCs w:val="32"/>
+              </w:rPr>
+              <w:t>Report Management</w:t>
+            </w:r>
+          </w:p>
+        </w:tc>
+        <w:tc>
+          <w:tcPr>
+            <w:tcW w:w="2603" w:type="dxa"/>
+            <w:gridSpan w:val="2"/>
+          </w:tcPr>
+          <w:p>
+            <w:pPr>
+              <w:rPr>
+                <w:rFonts w:ascii="TH SarabunPSK" w:hAnsi="TH SarabunPSK" w:cs="TH SarabunPSK" w:hint="cs"/>
+                <w:b/>
+                <w:bCs/>
+                <w:sz w:val="32"/>
+                <w:szCs w:val="32"/>
+                <w:lang w:bidi="th-TH"/>
+              </w:rPr>
+            </w:pPr>
+            <w:r>
+              <w:rPr>
+                <w:rFonts w:ascii="TH SarabunPSK" w:hAnsi="TH SarabunPSK" w:cs="TH SarabunPSK"/>
+                <w:sz w:val="32"/>
+                <w:szCs w:val="32"/>
+                <w:cs/>
+                <w:lang w:bidi="th-TH"/>
+              </w:rPr>
+              <w:t xml:space="preserve">อยู่หน้า </w:t>
+            </w:r>
+            <w:r>
+              <w:rPr>
+                <w:rFonts w:ascii="TH SarabunPSK" w:hAnsi="TH SarabunPSK" w:cs="TH SarabunPSK"/>
+                <w:sz w:val="32"/>
+                <w:szCs w:val="32"/>
+              </w:rPr>
+              <w:t>Report Management</w:t>
+            </w:r>
+          </w:p>
+        </w:tc>
+        <w:tc>
+          <w:tcPr>
+            <w:tcW w:w="2279" w:type="dxa"/>
+            <w:vMerge/>
+          </w:tcPr>
+          <w:p>
+            <w:pPr>
+              <w:jc w:val="center"/>
+              <w:rPr>
+                <w:rFonts w:ascii="TH SarabunPSK" w:hAnsi="TH SarabunPSK" w:cs="TH SarabunPSK" w:hint="cs"/>
+                <w:b/>
+                <w:bCs/>
+                <w:sz w:val="32"/>
+                <w:szCs w:val="32"/>
+                <w:lang w:bidi="th-TH"/>
+              </w:rPr>
+            </w:pPr>
+          </w:p>
+        </w:tc>
+        <w:tc>
+          <w:tcPr>
+            <w:tcW w:w="1352" w:type="dxa"/>
+            <w:vMerge/>
+          </w:tcPr>
+          <w:p>
+            <w:pPr>
+              <w:rPr>
+                <w:rFonts w:ascii="TH SarabunPSK" w:hAnsi="TH SarabunPSK" w:cs="TH SarabunPSK" w:hint="cs"/>
+                <w:b/>
+                <w:bCs/>
+                <w:sz w:val="32"/>
+                <w:szCs w:val="32"/>
+                <w:lang w:bidi="th-TH"/>
+              </w:rPr>
+            </w:pPr>
+          </w:p>
+        </w:tc>
+      </w:tr>
+      <w:tr>
+        <w:tc>
+          <w:tcPr>
+            <w:tcW w:w="630" w:type="dxa"/>
+          </w:tcPr>
+          <w:p>
+            <w:pPr>
+              <w:jc w:val="center"/>
+              <w:rPr>
+                <w:rFonts w:ascii="TH SarabunPSK" w:hAnsi="TH SarabunPSK" w:cs="TH SarabunPSK"/>
+                <w:sz w:val="32"/>
+                <w:szCs w:val="32"/>
+                <w:lang w:bidi="th-TH"/>
+              </w:rPr>
+            </w:pPr>
+            <w:r>
+              <w:rPr>
+                <w:rFonts w:ascii="TH SarabunPSK" w:hAnsi="TH SarabunPSK" w:cs="TH SarabunPSK" w:hint="cs"/>
+                <w:b/>
+                <w:bCs/>
+                <w:sz w:val="32"/>
+                <w:szCs w:val="32"/>
+                <w:lang w:bidi="th-TH"/>
+              </w:rPr>
+              <w:lastRenderedPageBreak/>
+              <w:t>No</w:t>
+            </w:r>
+            <w:r>
+              <w:rPr>
+                <w:rFonts w:ascii="TH SarabunPSK" w:hAnsi="TH SarabunPSK" w:cs="TH SarabunPSK" w:hint="cs"/>
+                <w:b/>
+                <w:bCs/>
+                <w:sz w:val="32"/>
+                <w:szCs w:val="32"/>
+                <w:cs/>
+                <w:lang w:bidi="th-TH"/>
+              </w:rPr>
+              <w:t>.</w:t>
+            </w:r>
+          </w:p>
+        </w:tc>
+        <w:tc>
+          <w:tcPr>
+            <w:tcW w:w="4507" w:type="dxa"/>
+            <w:gridSpan w:val="2"/>
+          </w:tcPr>
+          <w:p>
+            <w:pPr>
+              <w:rPr>
+                <w:rFonts w:ascii="TH SarabunPSK" w:hAnsi="TH SarabunPSK" w:cs="TH SarabunPSK"/>
+                <w:sz w:val="32"/>
+                <w:szCs w:val="32"/>
+                <w:lang w:bidi="th-TH"/>
+              </w:rPr>
+            </w:pPr>
+            <w:r>
+              <w:rPr>
+                <w:rFonts w:ascii="TH SarabunPSK" w:hAnsi="TH SarabunPSK" w:cs="TH SarabunPSK" w:hint="cs"/>
+                <w:b/>
+                <w:bCs/>
+                <w:sz w:val="32"/>
+                <w:szCs w:val="32"/>
+                <w:lang w:bidi="th-TH"/>
+              </w:rPr>
+              <w:t>Test Case and Steps</w:t>
+            </w:r>
+          </w:p>
+        </w:tc>
+        <w:tc>
+          <w:tcPr>
+            <w:tcW w:w="2759" w:type="dxa"/>
+          </w:tcPr>
+          <w:p>
+            <w:pPr>
+              <w:rPr>
+                <w:rFonts w:ascii="TH SarabunPSK" w:hAnsi="TH SarabunPSK" w:cs="TH SarabunPSK"/>
+                <w:sz w:val="32"/>
+                <w:szCs w:val="32"/>
+                <w:cs/>
+                <w:lang w:bidi="th-TH"/>
+              </w:rPr>
+            </w:pPr>
+            <w:r>
+              <w:rPr>
+                <w:rFonts w:ascii="TH SarabunPSK" w:hAnsi="TH SarabunPSK" w:cs="TH SarabunPSK" w:hint="cs"/>
+                <w:b/>
+                <w:bCs/>
+                <w:sz w:val="32"/>
+                <w:szCs w:val="32"/>
+                <w:lang w:bidi="th-TH"/>
+              </w:rPr>
+              <w:t>Expected Result</w:t>
+            </w:r>
+          </w:p>
+        </w:tc>
+        <w:tc>
+          <w:tcPr>
+            <w:tcW w:w="2603" w:type="dxa"/>
+            <w:gridSpan w:val="2"/>
+          </w:tcPr>
+          <w:p>
+            <w:pPr>
+              <w:rPr>
+                <w:rFonts w:ascii="TH SarabunPSK" w:hAnsi="TH SarabunPSK" w:cs="TH SarabunPSK"/>
+                <w:sz w:val="32"/>
+                <w:szCs w:val="32"/>
+                <w:cs/>
+                <w:lang w:bidi="th-TH"/>
+              </w:rPr>
+            </w:pPr>
+            <w:r>
+              <w:rPr>
+                <w:rFonts w:ascii="TH SarabunPSK" w:hAnsi="TH SarabunPSK" w:cs="TH SarabunPSK" w:hint="cs"/>
+                <w:b/>
+                <w:bCs/>
+                <w:sz w:val="32"/>
+                <w:szCs w:val="32"/>
+                <w:lang w:bidi="th-TH"/>
+              </w:rPr>
+              <w:t>Actual Result</w:t>
+            </w:r>
+          </w:p>
+        </w:tc>
+        <w:tc>
+          <w:tcPr>
+            <w:tcW w:w="2279" w:type="dxa"/>
+          </w:tcPr>
+          <w:p>
+            <w:pPr>
+              <w:jc w:val="center"/>
+              <w:rPr>
+                <w:rFonts w:ascii="TH SarabunPSK" w:hAnsi="TH SarabunPSK" w:cs="TH SarabunPSK" w:hint="cs"/>
+                <w:b/>
+                <w:bCs/>
+                <w:sz w:val="32"/>
+                <w:szCs w:val="32"/>
+                <w:lang w:bidi="th-TH"/>
+              </w:rPr>
+            </w:pPr>
+            <w:r>
+              <w:rPr>
+                <w:rFonts w:ascii="TH SarabunPSK" w:hAnsi="TH SarabunPSK" w:cs="TH SarabunPSK" w:hint="cs"/>
+                <w:b/>
+                <w:bCs/>
+                <w:sz w:val="32"/>
+                <w:szCs w:val="32"/>
+                <w:lang w:bidi="th-TH"/>
+              </w:rPr>
+              <w:t xml:space="preserve">Test Result </w:t>
+            </w:r>
+            <w:r>
+              <w:rPr>
+                <w:rFonts w:ascii="TH SarabunPSK" w:hAnsi="TH SarabunPSK" w:cs="TH SarabunPSK" w:hint="cs"/>
+                <w:b/>
+                <w:bCs/>
+                <w:sz w:val="32"/>
+                <w:szCs w:val="32"/>
+                <w:cs/>
+                <w:lang w:bidi="th-TH"/>
+              </w:rPr>
+              <w:t>(</w:t>
+            </w:r>
+            <w:r>
+              <w:rPr>
+                <w:rFonts w:ascii="TH SarabunPSK" w:hAnsi="TH SarabunPSK" w:cs="TH SarabunPSK" w:hint="cs"/>
+                <w:b/>
+                <w:bCs/>
+                <w:sz w:val="32"/>
+                <w:szCs w:val="32"/>
+                <w:lang w:bidi="th-TH"/>
+              </w:rPr>
+              <w:t>Pass</w:t>
+            </w:r>
+            <w:r>
+              <w:rPr>
+                <w:rFonts w:ascii="TH SarabunPSK" w:hAnsi="TH SarabunPSK" w:cs="TH SarabunPSK" w:hint="cs"/>
+                <w:b/>
+                <w:bCs/>
+                <w:sz w:val="32"/>
+                <w:szCs w:val="32"/>
+                <w:cs/>
+                <w:lang w:bidi="th-TH"/>
+              </w:rPr>
+              <w:t>/</w:t>
+            </w:r>
+            <w:r>
+              <w:rPr>
+                <w:rFonts w:ascii="TH SarabunPSK" w:hAnsi="TH SarabunPSK" w:cs="TH SarabunPSK" w:hint="cs"/>
+                <w:b/>
+                <w:bCs/>
+                <w:sz w:val="32"/>
+                <w:szCs w:val="32"/>
+                <w:lang w:bidi="th-TH"/>
+              </w:rPr>
+              <w:t>Fail</w:t>
+            </w:r>
+            <w:r>
+              <w:rPr>
+                <w:rFonts w:ascii="TH SarabunPSK" w:hAnsi="TH SarabunPSK" w:cs="TH SarabunPSK" w:hint="cs"/>
+                <w:b/>
+                <w:bCs/>
+                <w:sz w:val="32"/>
+                <w:szCs w:val="32"/>
+                <w:cs/>
+                <w:lang w:bidi="th-TH"/>
+              </w:rPr>
+              <w:t>)</w:t>
+            </w:r>
+          </w:p>
+        </w:tc>
+        <w:tc>
+          <w:tcPr>
+            <w:tcW w:w="1352" w:type="dxa"/>
+          </w:tcPr>
+          <w:p>
+            <w:pPr>
+              <w:rPr>
+                <w:rFonts w:ascii="TH SarabunPSK" w:hAnsi="TH SarabunPSK" w:cs="TH SarabunPSK"/>
+                <w:sz w:val="32"/>
+                <w:szCs w:val="32"/>
+                <w:lang w:bidi="th-TH"/>
+              </w:rPr>
+            </w:pPr>
+            <w:r>
+              <w:rPr>
+                <w:rFonts w:ascii="TH SarabunPSK" w:hAnsi="TH SarabunPSK" w:cs="TH SarabunPSK" w:hint="cs"/>
+                <w:b/>
+                <w:bCs/>
+                <w:sz w:val="32"/>
+                <w:szCs w:val="32"/>
+                <w:lang w:bidi="th-TH"/>
+              </w:rPr>
+              <w:t>Remark</w:t>
+            </w:r>
+          </w:p>
+        </w:tc>
+      </w:tr>
+      <w:tr>
+        <w:tc>
+          <w:tcPr>
+            <w:tcW w:w="630" w:type="dxa"/>
+          </w:tcPr>
+          <w:p>
+            <w:pPr>
+              <w:jc w:val="center"/>
+              <w:rPr>
+                <w:rFonts w:ascii="TH SarabunPSK" w:hAnsi="TH SarabunPSK" w:cs="TH SarabunPSK"/>
+                <w:sz w:val="32"/>
+                <w:szCs w:val="32"/>
+                <w:lang w:bidi="th-TH"/>
+              </w:rPr>
+            </w:pPr>
+            <w:r>
+              <w:rPr>
+                <w:rFonts w:ascii="TH SarabunPSK" w:hAnsi="TH SarabunPSK" w:cs="TH SarabunPSK"/>
+                <w:sz w:val="32"/>
+                <w:szCs w:val="32"/>
+                <w:lang w:bidi="th-TH"/>
+              </w:rPr>
+              <w:t>1</w:t>
+            </w:r>
+          </w:p>
+        </w:tc>
+        <w:tc>
+          <w:tcPr>
+            <w:tcW w:w="4507" w:type="dxa"/>
+            <w:gridSpan w:val="2"/>
+          </w:tcPr>
+          <w:p>
+            <w:pPr>
+              <w:rPr>
+                <w:rFonts w:ascii="TH SarabunPSK" w:hAnsi="TH SarabunPSK" w:cs="TH SarabunPSK"/>
+                <w:sz w:val="32"/>
+                <w:szCs w:val="32"/>
+                <w:lang w:bidi="th-TH"/>
+              </w:rPr>
+            </w:pPr>
+            <w:r>
+              <w:rPr>
+                <w:rFonts w:ascii="TH SarabunPSK" w:hAnsi="TH SarabunPSK" w:cs="TH SarabunPSK"/>
+                <w:sz w:val="32"/>
+                <w:szCs w:val="32"/>
+                <w:cs/>
+                <w:lang w:bidi="th-TH"/>
+              </w:rPr>
+              <w:t>อยู่หน้ารายละเอียดการรายงานผู้ขับขี่</w:t>
+            </w:r>
+          </w:p>
+          <w:p>
+            <w:pPr>
+              <w:rPr>
+                <w:rFonts w:ascii="TH SarabunPSK" w:hAnsi="TH SarabunPSK" w:cs="TH SarabunPSK"/>
+                <w:sz w:val="32"/>
+                <w:szCs w:val="32"/>
+                <w:lang w:bidi="th-TH"/>
+              </w:rPr>
+            </w:pPr>
+          </w:p>
+        </w:tc>
+        <w:tc>
+          <w:tcPr>
+            <w:tcW w:w="2759" w:type="dxa"/>
+          </w:tcPr>
+          <w:p>
+            <w:pPr>
+              <w:rPr>
+                <w:rFonts w:ascii="TH SarabunPSK" w:hAnsi="TH SarabunPSK" w:cs="TH SarabunPSK"/>
+                <w:sz w:val="32"/>
+                <w:szCs w:val="32"/>
+                <w:cs/>
+                <w:lang w:bidi="th-TH"/>
+              </w:rPr>
+            </w:pPr>
+          </w:p>
+        </w:tc>
+        <w:tc>
+          <w:tcPr>
+            <w:tcW w:w="2603" w:type="dxa"/>
+            <w:gridSpan w:val="2"/>
+          </w:tcPr>
+          <w:p>
+            <w:pPr>
+              <w:rPr>
+                <w:rFonts w:ascii="TH SarabunPSK" w:hAnsi="TH SarabunPSK" w:cs="TH SarabunPSK"/>
+                <w:sz w:val="32"/>
+                <w:szCs w:val="32"/>
+                <w:cs/>
+                <w:lang w:bidi="th-TH"/>
+              </w:rPr>
+            </w:pPr>
+          </w:p>
+        </w:tc>
+        <w:tc>
+          <w:tcPr>
+            <w:tcW w:w="2279" w:type="dxa"/>
+          </w:tcPr>
+          <w:p>
+            <w:pPr>
+              <w:jc w:val="center"/>
+              <w:rPr>
+                <w:rFonts w:ascii="TH SarabunPSK" w:hAnsi="TH SarabunPSK" w:cs="TH SarabunPSK" w:hint="cs"/>
+                <w:b/>
+                <w:bCs/>
+                <w:sz w:val="32"/>
+                <w:szCs w:val="32"/>
+                <w:lang w:bidi="th-TH"/>
+              </w:rPr>
+            </w:pPr>
+          </w:p>
+        </w:tc>
+        <w:tc>
+          <w:tcPr>
+            <w:tcW w:w="1352" w:type="dxa"/>
+          </w:tcPr>
+          <w:p>
+            <w:pPr>
+              <w:rPr>
+                <w:rFonts w:ascii="TH SarabunPSK" w:hAnsi="TH SarabunPSK" w:cs="TH SarabunPSK"/>
+                <w:sz w:val="32"/>
+                <w:szCs w:val="32"/>
+                <w:lang w:bidi="th-TH"/>
+              </w:rPr>
+            </w:pPr>
+          </w:p>
+        </w:tc>
+      </w:tr>
+      <w:tr>
+        <w:tc>
+          <w:tcPr>
+            <w:tcW w:w="630" w:type="dxa"/>
+          </w:tcPr>
+          <w:p>
+            <w:pPr>
+              <w:jc w:val="center"/>
+              <w:rPr>
+                <w:rFonts w:ascii="TH SarabunPSK" w:hAnsi="TH SarabunPSK" w:cs="TH SarabunPSK"/>
+                <w:sz w:val="32"/>
+                <w:szCs w:val="32"/>
+                <w:lang w:bidi="th-TH"/>
+              </w:rPr>
+            </w:pPr>
+            <w:r>
+              <w:rPr>
+                <w:rFonts w:ascii="TH SarabunPSK" w:hAnsi="TH SarabunPSK" w:cs="TH SarabunPSK"/>
+                <w:sz w:val="32"/>
+                <w:szCs w:val="32"/>
+                <w:lang w:bidi="th-TH"/>
+              </w:rPr>
+              <w:t>2</w:t>
+            </w:r>
+          </w:p>
+        </w:tc>
+        <w:tc>
+          <w:tcPr>
+            <w:tcW w:w="4507" w:type="dxa"/>
+            <w:gridSpan w:val="2"/>
+          </w:tcPr>
+          <w:p>
+            <w:pPr>
+              <w:rPr>
+                <w:rFonts w:ascii="TH SarabunPSK" w:hAnsi="TH SarabunPSK" w:cs="TH SarabunPSK"/>
+                <w:sz w:val="32"/>
+                <w:szCs w:val="32"/>
+                <w:lang w:bidi="th-TH"/>
+              </w:rPr>
+            </w:pPr>
+            <w:r>
+              <w:rPr>
+                <w:rFonts w:ascii="TH SarabunPSK" w:hAnsi="TH SarabunPSK" w:cs="TH SarabunPSK"/>
+                <w:sz w:val="32"/>
+                <w:szCs w:val="32"/>
+                <w:cs/>
+                <w:lang w:bidi="th-TH"/>
+              </w:rPr>
+              <w:t xml:space="preserve">กดเปลี่ยนสถานะเป็น </w:t>
+            </w:r>
+            <w:r>
+              <w:rPr>
+                <w:rFonts w:ascii="TH SarabunPSK" w:hAnsi="TH SarabunPSK" w:cs="TH SarabunPSK"/>
+                <w:sz w:val="32"/>
+                <w:szCs w:val="32"/>
+                <w:lang w:bidi="th-TH"/>
+              </w:rPr>
+              <w:t>approve</w:t>
+            </w:r>
+          </w:p>
+        </w:tc>
+        <w:tc>
+          <w:tcPr>
+            <w:tcW w:w="2759" w:type="dxa"/>
+          </w:tcPr>
+          <w:p>
+            <w:pPr>
+              <w:rPr>
+                <w:rFonts w:ascii="TH SarabunPSK" w:hAnsi="TH SarabunPSK" w:cs="TH SarabunPSK"/>
+                <w:sz w:val="32"/>
+                <w:szCs w:val="32"/>
+                <w:cs/>
                 <w:lang w:bidi="th-TH"/>
               </w:rPr>
             </w:pPr>
@@ -1864,39 +2485,624 @@
                 <w:sz w:val="32"/>
                 <w:szCs w:val="32"/>
               </w:rPr>
+              <w:t>approve</w:t>
+            </w:r>
+          </w:p>
+        </w:tc>
+        <w:tc>
+          <w:tcPr>
+            <w:tcW w:w="2603" w:type="dxa"/>
+            <w:gridSpan w:val="2"/>
+          </w:tcPr>
+          <w:p>
+            <w:pPr>
+              <w:rPr>
+                <w:rFonts w:ascii="TH SarabunPSK" w:hAnsi="TH SarabunPSK" w:cs="TH SarabunPSK"/>
+                <w:sz w:val="32"/>
+                <w:szCs w:val="32"/>
+                <w:lang w:bidi="th-TH"/>
+              </w:rPr>
+            </w:pPr>
+            <w:r>
+              <w:rPr>
+                <w:rFonts w:ascii="TH SarabunPSK" w:hAnsi="TH SarabunPSK" w:cs="TH SarabunPSK"/>
+                <w:sz w:val="32"/>
+                <w:szCs w:val="32"/>
+                <w:cs/>
+                <w:lang w:bidi="th-TH"/>
+              </w:rPr>
+              <w:t xml:space="preserve">สถานะคำร้องที่เลือกเปลี่ยนเป็น </w:t>
+            </w:r>
+            <w:r>
+              <w:rPr>
+                <w:rFonts w:ascii="TH SarabunPSK" w:hAnsi="TH SarabunPSK" w:cs="TH SarabunPSK"/>
+                <w:sz w:val="32"/>
+                <w:szCs w:val="32"/>
+              </w:rPr>
+              <w:t>approve</w:t>
+            </w:r>
+          </w:p>
+        </w:tc>
+        <w:tc>
+          <w:tcPr>
+            <w:tcW w:w="2279" w:type="dxa"/>
+            <w:vAlign w:val="center"/>
+          </w:tcPr>
+          <w:p>
+            <w:pPr>
+              <w:jc w:val="center"/>
+              <w:rPr>
+                <w:rFonts w:ascii="TH SarabunPSK" w:hAnsi="TH SarabunPSK" w:cs="TH SarabunPSK"/>
+                <w:sz w:val="32"/>
+                <w:szCs w:val="32"/>
+                <w:lang w:bidi="th-TH"/>
+              </w:rPr>
+            </w:pPr>
+            <w:r>
+              <w:rPr>
+                <w:rFonts w:ascii="TH SarabunPSK" w:hAnsi="TH SarabunPSK" w:cs="TH SarabunPSK" w:hint="cs"/>
+                <w:b/>
+                <w:bCs/>
+                <w:sz w:val="32"/>
+                <w:szCs w:val="32"/>
+                <w:lang w:bidi="th-TH"/>
+              </w:rPr>
+              <w:t>Pass</w:t>
+            </w:r>
+          </w:p>
+        </w:tc>
+        <w:tc>
+          <w:tcPr>
+            <w:tcW w:w="1352" w:type="dxa"/>
+          </w:tcPr>
+          <w:p>
+            <w:pPr>
+              <w:rPr>
+                <w:rFonts w:ascii="TH SarabunPSK" w:hAnsi="TH SarabunPSK" w:cs="TH SarabunPSK"/>
+                <w:sz w:val="32"/>
+                <w:szCs w:val="32"/>
+                <w:lang w:bidi="th-TH"/>
+              </w:rPr>
+            </w:pPr>
+          </w:p>
+        </w:tc>
+      </w:tr>
+      <w:tr>
+        <w:tc>
+          <w:tcPr>
+            <w:tcW w:w="630" w:type="dxa"/>
+          </w:tcPr>
+          <w:p>
+            <w:pPr>
+              <w:jc w:val="center"/>
+              <w:rPr>
+                <w:rFonts w:ascii="TH SarabunPSK" w:hAnsi="TH SarabunPSK" w:cs="TH SarabunPSK"/>
+                <w:sz w:val="32"/>
+                <w:szCs w:val="32"/>
+                <w:lang w:bidi="th-TH"/>
+              </w:rPr>
+            </w:pPr>
+            <w:r>
+              <w:rPr>
+                <w:rFonts w:ascii="TH SarabunPSK" w:hAnsi="TH SarabunPSK" w:cs="TH SarabunPSK" w:hint="cs"/>
+                <w:b/>
+                <w:bCs/>
+                <w:sz w:val="32"/>
+                <w:szCs w:val="32"/>
+                <w:lang w:bidi="th-TH"/>
+              </w:rPr>
+              <w:t>No</w:t>
+            </w:r>
+            <w:r>
+              <w:rPr>
+                <w:rFonts w:ascii="TH SarabunPSK" w:hAnsi="TH SarabunPSK" w:cs="TH SarabunPSK" w:hint="cs"/>
+                <w:b/>
+                <w:bCs/>
+                <w:sz w:val="32"/>
+                <w:szCs w:val="32"/>
+                <w:cs/>
+                <w:lang w:bidi="th-TH"/>
+              </w:rPr>
+              <w:t>.</w:t>
+            </w:r>
+          </w:p>
+        </w:tc>
+        <w:tc>
+          <w:tcPr>
+            <w:tcW w:w="4507" w:type="dxa"/>
+            <w:gridSpan w:val="2"/>
+          </w:tcPr>
+          <w:p>
+            <w:pPr>
+              <w:rPr>
+                <w:rFonts w:ascii="TH SarabunPSK" w:hAnsi="TH SarabunPSK" w:cs="TH SarabunPSK"/>
+                <w:sz w:val="32"/>
+                <w:szCs w:val="32"/>
+                <w:lang w:bidi="th-TH"/>
+              </w:rPr>
+            </w:pPr>
+            <w:r>
+              <w:rPr>
+                <w:rFonts w:ascii="TH SarabunPSK" w:hAnsi="TH SarabunPSK" w:cs="TH SarabunPSK" w:hint="cs"/>
+                <w:b/>
+                <w:bCs/>
+                <w:sz w:val="32"/>
+                <w:szCs w:val="32"/>
+                <w:lang w:bidi="th-TH"/>
+              </w:rPr>
+              <w:t>Test Case and Steps</w:t>
+            </w:r>
+          </w:p>
+        </w:tc>
+        <w:tc>
+          <w:tcPr>
+            <w:tcW w:w="2759" w:type="dxa"/>
+          </w:tcPr>
+          <w:p>
+            <w:pPr>
+              <w:rPr>
+                <w:rFonts w:ascii="TH SarabunPSK" w:hAnsi="TH SarabunPSK" w:cs="TH SarabunPSK"/>
+                <w:sz w:val="32"/>
+                <w:szCs w:val="32"/>
+                <w:cs/>
+                <w:lang w:bidi="th-TH"/>
+              </w:rPr>
+            </w:pPr>
+            <w:r>
+              <w:rPr>
+                <w:rFonts w:ascii="TH SarabunPSK" w:hAnsi="TH SarabunPSK" w:cs="TH SarabunPSK" w:hint="cs"/>
+                <w:b/>
+                <w:bCs/>
+                <w:sz w:val="32"/>
+                <w:szCs w:val="32"/>
+                <w:lang w:bidi="th-TH"/>
+              </w:rPr>
+              <w:t>Expected Result</w:t>
+            </w:r>
+          </w:p>
+        </w:tc>
+        <w:tc>
+          <w:tcPr>
+            <w:tcW w:w="2603" w:type="dxa"/>
+            <w:gridSpan w:val="2"/>
+          </w:tcPr>
+          <w:p>
+            <w:pPr>
+              <w:rPr>
+                <w:rFonts w:ascii="TH SarabunPSK" w:hAnsi="TH SarabunPSK" w:cs="TH SarabunPSK"/>
+                <w:sz w:val="32"/>
+                <w:szCs w:val="32"/>
+                <w:cs/>
+                <w:lang w:bidi="th-TH"/>
+              </w:rPr>
+            </w:pPr>
+            <w:r>
+              <w:rPr>
+                <w:rFonts w:ascii="TH SarabunPSK" w:hAnsi="TH SarabunPSK" w:cs="TH SarabunPSK" w:hint="cs"/>
+                <w:b/>
+                <w:bCs/>
+                <w:sz w:val="32"/>
+                <w:szCs w:val="32"/>
+                <w:lang w:bidi="th-TH"/>
+              </w:rPr>
+              <w:t>Actual Result</w:t>
+            </w:r>
+          </w:p>
+        </w:tc>
+        <w:tc>
+          <w:tcPr>
+            <w:tcW w:w="2279" w:type="dxa"/>
+          </w:tcPr>
+          <w:p>
+            <w:pPr>
+              <w:rPr>
+                <w:rFonts w:ascii="TH SarabunPSK" w:hAnsi="TH SarabunPSK" w:cs="TH SarabunPSK" w:hint="cs"/>
+                <w:b/>
+                <w:bCs/>
+                <w:sz w:val="32"/>
+                <w:szCs w:val="32"/>
+                <w:lang w:bidi="th-TH"/>
+              </w:rPr>
+            </w:pPr>
+            <w:r>
+              <w:rPr>
+                <w:rFonts w:ascii="TH SarabunPSK" w:hAnsi="TH SarabunPSK" w:cs="TH SarabunPSK" w:hint="cs"/>
+                <w:b/>
+                <w:bCs/>
+                <w:sz w:val="32"/>
+                <w:szCs w:val="32"/>
+                <w:lang w:bidi="th-TH"/>
+              </w:rPr>
+              <w:t xml:space="preserve">Test Result </w:t>
+            </w:r>
+            <w:r>
+              <w:rPr>
+                <w:rFonts w:ascii="TH SarabunPSK" w:hAnsi="TH SarabunPSK" w:cs="TH SarabunPSK" w:hint="cs"/>
+                <w:b/>
+                <w:bCs/>
+                <w:sz w:val="32"/>
+                <w:szCs w:val="32"/>
+                <w:cs/>
+                <w:lang w:bidi="th-TH"/>
+              </w:rPr>
+              <w:t>(</w:t>
+            </w:r>
+            <w:r>
+              <w:rPr>
+                <w:rFonts w:ascii="TH SarabunPSK" w:hAnsi="TH SarabunPSK" w:cs="TH SarabunPSK" w:hint="cs"/>
+                <w:b/>
+                <w:bCs/>
+                <w:sz w:val="32"/>
+                <w:szCs w:val="32"/>
+                <w:lang w:bidi="th-TH"/>
+              </w:rPr>
+              <w:t>Pass</w:t>
+            </w:r>
+            <w:r>
+              <w:rPr>
+                <w:rFonts w:ascii="TH SarabunPSK" w:hAnsi="TH SarabunPSK" w:cs="TH SarabunPSK" w:hint="cs"/>
+                <w:b/>
+                <w:bCs/>
+                <w:sz w:val="32"/>
+                <w:szCs w:val="32"/>
+                <w:cs/>
+                <w:lang w:bidi="th-TH"/>
+              </w:rPr>
+              <w:t>/</w:t>
+            </w:r>
+            <w:r>
+              <w:rPr>
+                <w:rFonts w:ascii="TH SarabunPSK" w:hAnsi="TH SarabunPSK" w:cs="TH SarabunPSK" w:hint="cs"/>
+                <w:b/>
+                <w:bCs/>
+                <w:sz w:val="32"/>
+                <w:szCs w:val="32"/>
+                <w:lang w:bidi="th-TH"/>
+              </w:rPr>
+              <w:t>Fail</w:t>
+            </w:r>
+            <w:r>
+              <w:rPr>
+                <w:rFonts w:ascii="TH SarabunPSK" w:hAnsi="TH SarabunPSK" w:cs="TH SarabunPSK" w:hint="cs"/>
+                <w:b/>
+                <w:bCs/>
+                <w:sz w:val="32"/>
+                <w:szCs w:val="32"/>
+                <w:cs/>
+                <w:lang w:bidi="th-TH"/>
+              </w:rPr>
+              <w:t>)</w:t>
+            </w:r>
+          </w:p>
+        </w:tc>
+        <w:tc>
+          <w:tcPr>
+            <w:tcW w:w="1352" w:type="dxa"/>
+          </w:tcPr>
+          <w:p>
+            <w:pPr>
+              <w:rPr>
+                <w:rFonts w:ascii="TH SarabunPSK" w:hAnsi="TH SarabunPSK" w:cs="TH SarabunPSK"/>
+                <w:sz w:val="32"/>
+                <w:szCs w:val="32"/>
+                <w:lang w:bidi="th-TH"/>
+              </w:rPr>
+            </w:pPr>
+            <w:r>
+              <w:rPr>
+                <w:rFonts w:ascii="TH SarabunPSK" w:hAnsi="TH SarabunPSK" w:cs="TH SarabunPSK" w:hint="cs"/>
+                <w:b/>
+                <w:bCs/>
+                <w:sz w:val="32"/>
+                <w:szCs w:val="32"/>
+                <w:lang w:bidi="th-TH"/>
+              </w:rPr>
+              <w:t>Remark</w:t>
+            </w:r>
+          </w:p>
+        </w:tc>
+      </w:tr>
+      <w:tr>
+        <w:tc>
+          <w:tcPr>
+            <w:tcW w:w="630" w:type="dxa"/>
+          </w:tcPr>
+          <w:p>
+            <w:pPr>
+              <w:jc w:val="center"/>
+              <w:rPr>
+                <w:rFonts w:ascii="TH SarabunPSK" w:hAnsi="TH SarabunPSK" w:cs="TH SarabunPSK"/>
+                <w:sz w:val="32"/>
+                <w:szCs w:val="32"/>
+                <w:lang w:bidi="th-TH"/>
+              </w:rPr>
+            </w:pPr>
+            <w:r>
+              <w:rPr>
+                <w:rFonts w:ascii="TH SarabunPSK" w:hAnsi="TH SarabunPSK" w:cs="TH SarabunPSK"/>
+                <w:sz w:val="32"/>
+                <w:szCs w:val="32"/>
+                <w:lang w:bidi="th-TH"/>
+              </w:rPr>
+              <w:t>1</w:t>
+            </w:r>
+          </w:p>
+        </w:tc>
+        <w:tc>
+          <w:tcPr>
+            <w:tcW w:w="4507" w:type="dxa"/>
+            <w:gridSpan w:val="2"/>
+          </w:tcPr>
+          <w:p>
+            <w:pPr>
+              <w:rPr>
+                <w:rFonts w:ascii="TH SarabunPSK" w:hAnsi="TH SarabunPSK" w:cs="TH SarabunPSK"/>
+                <w:sz w:val="32"/>
+                <w:szCs w:val="32"/>
+                <w:lang w:bidi="th-TH"/>
+              </w:rPr>
+            </w:pPr>
+            <w:r>
+              <w:rPr>
+                <w:rFonts w:ascii="TH SarabunPSK" w:hAnsi="TH SarabunPSK" w:cs="TH SarabunPSK"/>
+                <w:sz w:val="32"/>
+                <w:szCs w:val="32"/>
+                <w:cs/>
+                <w:lang w:bidi="th-TH"/>
+              </w:rPr>
+              <w:t>อยู่หน้ารายละเอียดการรายงานผู้ขับขี่</w:t>
+            </w:r>
+          </w:p>
+        </w:tc>
+        <w:tc>
+          <w:tcPr>
+            <w:tcW w:w="2759" w:type="dxa"/>
+          </w:tcPr>
+          <w:p>
+            <w:pPr>
+              <w:jc w:val="center"/>
+              <w:rPr>
+                <w:rFonts w:ascii="TH SarabunPSK" w:hAnsi="TH SarabunPSK" w:cs="TH SarabunPSK"/>
+                <w:sz w:val="32"/>
+                <w:szCs w:val="32"/>
+                <w:lang w:bidi="th-TH"/>
+              </w:rPr>
+            </w:pPr>
+            <w:r>
+              <w:rPr>
+                <w:rFonts w:ascii="TH SarabunPSK" w:hAnsi="TH SarabunPSK" w:cs="TH SarabunPSK"/>
+                <w:sz w:val="32"/>
+                <w:szCs w:val="32"/>
+                <w:lang w:bidi="th-TH"/>
+              </w:rPr>
+              <w:t>-</w:t>
+            </w:r>
+          </w:p>
+        </w:tc>
+        <w:tc>
+          <w:tcPr>
+            <w:tcW w:w="2603" w:type="dxa"/>
+            <w:gridSpan w:val="2"/>
+          </w:tcPr>
+          <w:p>
+            <w:pPr>
+              <w:jc w:val="center"/>
+              <w:rPr>
+                <w:rFonts w:ascii="TH SarabunPSK" w:hAnsi="TH SarabunPSK" w:cs="TH SarabunPSK"/>
+                <w:sz w:val="32"/>
+                <w:szCs w:val="32"/>
+                <w:lang w:bidi="th-TH"/>
+              </w:rPr>
+            </w:pPr>
+            <w:r>
+              <w:rPr>
+                <w:rFonts w:ascii="TH SarabunPSK" w:hAnsi="TH SarabunPSK" w:cs="TH SarabunPSK"/>
+                <w:sz w:val="32"/>
+                <w:szCs w:val="32"/>
+                <w:lang w:bidi="th-TH"/>
+              </w:rPr>
+              <w:t>-</w:t>
+            </w:r>
+          </w:p>
+        </w:tc>
+        <w:tc>
+          <w:tcPr>
+            <w:tcW w:w="2279" w:type="dxa"/>
+            <w:vMerge w:val="restart"/>
+            <w:vAlign w:val="center"/>
+          </w:tcPr>
+          <w:p>
+            <w:pPr>
+              <w:jc w:val="center"/>
+              <w:rPr>
+                <w:rFonts w:ascii="TH SarabunPSK" w:hAnsi="TH SarabunPSK" w:cs="TH SarabunPSK"/>
+                <w:sz w:val="32"/>
+                <w:szCs w:val="32"/>
+                <w:lang w:bidi="th-TH"/>
+              </w:rPr>
+            </w:pPr>
+            <w:r>
+              <w:rPr>
+                <w:rFonts w:ascii="TH SarabunPSK" w:hAnsi="TH SarabunPSK" w:cs="TH SarabunPSK" w:hint="cs"/>
+                <w:b/>
+                <w:bCs/>
+                <w:sz w:val="32"/>
+                <w:szCs w:val="32"/>
+                <w:lang w:bidi="th-TH"/>
+              </w:rPr>
+              <w:t>Pass</w:t>
+            </w:r>
+          </w:p>
+        </w:tc>
+        <w:tc>
+          <w:tcPr>
+            <w:tcW w:w="1352" w:type="dxa"/>
+            <w:vMerge w:val="restart"/>
+          </w:tcPr>
+          <w:p>
+            <w:pPr>
+              <w:rPr>
+                <w:rFonts w:ascii="TH SarabunPSK" w:hAnsi="TH SarabunPSK" w:cs="TH SarabunPSK"/>
+                <w:sz w:val="32"/>
+                <w:szCs w:val="32"/>
+                <w:lang w:bidi="th-TH"/>
+              </w:rPr>
+            </w:pPr>
+          </w:p>
+        </w:tc>
+      </w:tr>
+      <w:tr>
+        <w:tc>
+          <w:tcPr>
+            <w:tcW w:w="630" w:type="dxa"/>
+          </w:tcPr>
+          <w:p>
+            <w:pPr>
+              <w:jc w:val="center"/>
+              <w:rPr>
+                <w:rFonts w:ascii="TH SarabunPSK" w:hAnsi="TH SarabunPSK" w:cs="TH SarabunPSK"/>
+                <w:sz w:val="32"/>
+                <w:szCs w:val="32"/>
+                <w:lang w:bidi="th-TH"/>
+              </w:rPr>
+            </w:pPr>
+            <w:r>
+              <w:rPr>
+                <w:rFonts w:ascii="TH SarabunPSK" w:hAnsi="TH SarabunPSK" w:cs="TH SarabunPSK"/>
+                <w:sz w:val="32"/>
+                <w:szCs w:val="32"/>
+                <w:lang w:bidi="th-TH"/>
+              </w:rPr>
+              <w:t>2</w:t>
+            </w:r>
+          </w:p>
+        </w:tc>
+        <w:tc>
+          <w:tcPr>
+            <w:tcW w:w="4507" w:type="dxa"/>
+            <w:gridSpan w:val="2"/>
+          </w:tcPr>
+          <w:p>
+            <w:pPr>
+              <w:rPr>
+                <w:rFonts w:ascii="TH SarabunPSK" w:hAnsi="TH SarabunPSK" w:cs="TH SarabunPSK"/>
+                <w:sz w:val="32"/>
+                <w:szCs w:val="32"/>
+                <w:lang w:bidi="th-TH"/>
+              </w:rPr>
+            </w:pPr>
+            <w:r>
+              <w:rPr>
+                <w:rFonts w:ascii="TH SarabunPSK" w:hAnsi="TH SarabunPSK" w:cs="TH SarabunPSK"/>
+                <w:sz w:val="32"/>
+                <w:szCs w:val="32"/>
+                <w:cs/>
+                <w:lang w:bidi="th-TH"/>
+              </w:rPr>
+              <w:t xml:space="preserve">กดเปลี่ยนสถานะเป็น </w:t>
+            </w:r>
+            <w:r>
+              <w:rPr>
+                <w:rFonts w:ascii="TH SarabunPSK" w:hAnsi="TH SarabunPSK" w:cs="TH SarabunPSK"/>
+                <w:sz w:val="32"/>
+                <w:szCs w:val="32"/>
+                <w:lang w:bidi="th-TH"/>
+              </w:rPr>
               <w:t>reject</w:t>
             </w:r>
           </w:p>
         </w:tc>
         <w:tc>
           <w:tcPr>
+            <w:tcW w:w="2759" w:type="dxa"/>
+          </w:tcPr>
+          <w:p>
+            <w:pPr>
+              <w:rPr>
+                <w:rFonts w:ascii="TH SarabunPSK" w:hAnsi="TH SarabunPSK" w:cs="TH SarabunPSK"/>
+                <w:sz w:val="32"/>
+                <w:szCs w:val="32"/>
+                <w:cs/>
+                <w:lang w:bidi="th-TH"/>
+              </w:rPr>
+            </w:pPr>
+            <w:r>
+              <w:rPr>
+                <w:rFonts w:ascii="TH SarabunPSK" w:hAnsi="TH SarabunPSK" w:cs="TH SarabunPSK"/>
+                <w:sz w:val="32"/>
+                <w:szCs w:val="32"/>
+                <w:cs/>
+                <w:lang w:bidi="th-TH"/>
+              </w:rPr>
+              <w:t xml:space="preserve">สถานะคำร้องที่เลือกเปลี่ยนเป็น </w:t>
+            </w:r>
+            <w:r>
+              <w:rPr>
+                <w:rFonts w:ascii="TH SarabunPSK" w:hAnsi="TH SarabunPSK" w:cs="TH SarabunPSK"/>
+                <w:sz w:val="32"/>
+                <w:szCs w:val="32"/>
+              </w:rPr>
+              <w:t>reject</w:t>
+            </w:r>
+          </w:p>
+        </w:tc>
+        <w:tc>
+          <w:tcPr>
+            <w:tcW w:w="2603" w:type="dxa"/>
+            <w:gridSpan w:val="2"/>
+          </w:tcPr>
+          <w:p>
+            <w:pPr>
+              <w:rPr>
+                <w:rFonts w:ascii="TH SarabunPSK" w:hAnsi="TH SarabunPSK" w:cs="TH SarabunPSK"/>
+                <w:sz w:val="32"/>
+                <w:szCs w:val="32"/>
+                <w:cs/>
+                <w:lang w:bidi="th-TH"/>
+              </w:rPr>
+            </w:pPr>
+            <w:r>
+              <w:rPr>
+                <w:rFonts w:ascii="TH SarabunPSK" w:hAnsi="TH SarabunPSK" w:cs="TH SarabunPSK"/>
+                <w:sz w:val="32"/>
+                <w:szCs w:val="32"/>
+                <w:cs/>
+                <w:lang w:bidi="th-TH"/>
+              </w:rPr>
+              <w:t xml:space="preserve">สถานะคำร้องที่เลือกเปลี่ยนเป็น </w:t>
+            </w:r>
+            <w:r>
+              <w:rPr>
+                <w:rFonts w:ascii="TH SarabunPSK" w:hAnsi="TH SarabunPSK" w:cs="TH SarabunPSK"/>
+                <w:sz w:val="32"/>
+                <w:szCs w:val="32"/>
+              </w:rPr>
+              <w:t>reject</w:t>
+            </w:r>
+          </w:p>
+        </w:tc>
+        <w:tc>
+          <w:tcPr>
             <w:tcW w:w="2279" w:type="dxa"/>
-          </w:tcPr>
-          <w:p>
-            <w:pPr>
-              <w:rPr>
-                <w:rFonts w:ascii="TH SarabunPSK" w:hAnsi="TH SarabunPSK" w:cs="TH SarabunPSK"/>
-                <w:sz w:val="32"/>
-                <w:szCs w:val="32"/>
-                <w:lang w:bidi="th-TH"/>
-              </w:rPr>
-            </w:pPr>
-            <w:r>
-              <w:rPr>
-                <w:rFonts w:ascii="TH SarabunPSK" w:hAnsi="TH SarabunPSK" w:cs="TH SarabunPSK" w:hint="cs"/>
-                <w:b/>
-                <w:bCs/>
-                <w:sz w:val="32"/>
-                <w:szCs w:val="32"/>
-                <w:lang w:bidi="th-TH"/>
-              </w:rPr>
-              <w:t>Pass</w:t>
-            </w:r>
+            <w:vMerge/>
+          </w:tcPr>
+          <w:p>
+            <w:pPr>
+              <w:rPr>
+                <w:rFonts w:ascii="TH SarabunPSK" w:hAnsi="TH SarabunPSK" w:cs="TH SarabunPSK" w:hint="cs"/>
+                <w:b/>
+                <w:bCs/>
+                <w:sz w:val="32"/>
+                <w:szCs w:val="32"/>
+                <w:lang w:bidi="th-TH"/>
+              </w:rPr>
+            </w:pPr>
           </w:p>
         </w:tc>
         <w:tc>
           <w:tcPr>
             <w:tcW w:w="1352" w:type="dxa"/>
+            <w:vMerge/>
           </w:tcPr>
           <w:p>
             <w:pPr>
@@ -1944,16 +3150,66 @@
     <w:p>
       <w:pPr>
         <w:rPr>
-          <w:rFonts w:ascii="TH SarabunPSK" w:hAnsi="TH SarabunPSK" w:cs="TH SarabunPSK" w:hint="cs"/>
+          <w:rFonts w:ascii="TH SarabunPSK" w:hAnsi="TH SarabunPSK" w:cs="TH SarabunPSK"/>
           <w:sz w:val="32"/>
           <w:szCs w:val="32"/>
           <w:lang w:bidi="th-TH"/>
         </w:rPr>
       </w:pPr>
     </w:p>
+    <w:p>
+      <w:pPr>
+        <w:rPr>
+          <w:rFonts w:ascii="TH SarabunPSK" w:hAnsi="TH SarabunPSK" w:cs="TH SarabunPSK"/>
+          <w:sz w:val="32"/>
+          <w:szCs w:val="32"/>
+          <w:lang w:bidi="th-TH"/>
+        </w:rPr>
+      </w:pPr>
+    </w:p>
+    <w:p>
+      <w:pPr>
+        <w:rPr>
+          <w:rFonts w:ascii="TH SarabunPSK" w:hAnsi="TH SarabunPSK" w:cs="TH SarabunPSK"/>
+          <w:sz w:val="32"/>
+          <w:szCs w:val="32"/>
+          <w:lang w:bidi="th-TH"/>
+        </w:rPr>
+      </w:pPr>
+    </w:p>
+    <w:p>
+      <w:pPr>
+        <w:rPr>
+          <w:rFonts w:ascii="TH SarabunPSK" w:hAnsi="TH SarabunPSK" w:cs="TH SarabunPSK"/>
+          <w:sz w:val="32"/>
+          <w:szCs w:val="32"/>
+          <w:lang w:bidi="th-TH"/>
+        </w:rPr>
+      </w:pPr>
+    </w:p>
+    <w:p>
+      <w:pPr>
+        <w:rPr>
+          <w:rFonts w:ascii="TH SarabunPSK" w:hAnsi="TH SarabunPSK" w:cs="TH SarabunPSK"/>
+          <w:sz w:val="32"/>
+          <w:szCs w:val="32"/>
+          <w:lang w:bidi="th-TH"/>
+        </w:rPr>
+      </w:pPr>
+    </w:p>
+    <w:p>
+      <w:pPr>
+        <w:rPr>
+          <w:rFonts w:ascii="TH SarabunPSK" w:hAnsi="TH SarabunPSK" w:cs="TH SarabunPSK"/>
+          <w:sz w:val="32"/>
+          <w:szCs w:val="32"/>
+          <w:lang w:bidi="th-TH"/>
+        </w:rPr>
+      </w:pPr>
+    </w:p>
     <w:tbl>
       <w:tblPr>
-        <w:tblStyle w:val="a8"/>
+        <w:tblStyle w:val="TableGrid"/>
         <w:tblW w:w="14097" w:type="dxa"/>
         <w:tblInd w:w="-635" w:type="dxa"/>
         <w:tblLook w:val="04A0" w:firstRow="1" w:lastRow="0" w:firstColumn="1" w:lastColumn="0" w:noHBand="0" w:noVBand="1"/>
@@ -1996,6 +3252,7 @@
                 <w:szCs w:val="32"/>
                 <w:lang w:bidi="th-TH"/>
               </w:rPr>
+              <w:lastRenderedPageBreak/>
               <w:t>Test Scenario ID</w:t>
             </w:r>
             <w:r>
@@ -2033,16 +3290,7 @@
                 <w:szCs w:val="32"/>
                 <w:lang w:bidi="th-TH"/>
               </w:rPr>
-              <w:t>API</w:t>
-            </w:r>
-            <w:r>
-              <w:rPr>
-                <w:rFonts w:ascii="TH SarabunPSK" w:hAnsi="TH SarabunPSK" w:cs="TH SarabunPSK"/>
-                <w:sz w:val="32"/>
-                <w:szCs w:val="32"/>
-                <w:lang w:bidi="th-TH"/>
-              </w:rPr>
-              <w:t>-PBI-6-</w:t>
+              <w:t>API-PBI-6-</w:t>
             </w:r>
             <w:r>
               <w:rPr>
@@ -2119,6 +3367,7 @@
                 <w:lang w:bidi="th-TH"/>
               </w:rPr>
             </w:pPr>
+            <w:proofErr w:type="spellStart"/>
             <w:r>
               <w:rPr>
                 <w:rFonts w:ascii="TH SarabunPSK" w:hAnsi="TH SarabunPSK" w:cs="TH SarabunPSK"/>
@@ -2128,6 +3377,7 @@
               </w:rPr>
               <w:t>Painamnae</w:t>
             </w:r>
+            <w:proofErr w:type="spellEnd"/>
           </w:p>
         </w:tc>
       </w:tr>
@@ -2342,6 +3592,7 @@
               </w:rPr>
               <w:t xml:space="preserve">เว็บไซต์ </w:t>
             </w:r>
+            <w:proofErr w:type="spellStart"/>
             <w:r>
               <w:rPr>
                 <w:rFonts w:ascii="TH SarabunPSK" w:hAnsi="TH SarabunPSK" w:cs="TH SarabunPSK"/>
@@ -2350,6 +3601,7 @@
               </w:rPr>
               <w:t>Painamnae</w:t>
             </w:r>
+            <w:proofErr w:type="spellEnd"/>
           </w:p>
         </w:tc>
         <w:tc>
@@ -2858,7 +4110,27 @@
                 <w:szCs w:val="32"/>
                 <w:lang w:bidi="th-TH"/>
               </w:rPr>
-              <w:t>As an admin, I want keep the users updated on their reported incidents.</w:t>
+              <w:t xml:space="preserve">As an admin, I want </w:t>
+            </w:r>
+            <w:proofErr w:type="gramStart"/>
+            <w:r>
+              <w:rPr>
+                <w:rFonts w:ascii="TH SarabunPSK" w:hAnsi="TH SarabunPSK" w:cs="TH SarabunPSK"/>
+                <w:sz w:val="32"/>
+                <w:szCs w:val="32"/>
+                <w:lang w:bidi="th-TH"/>
+              </w:rPr>
+              <w:t>keep</w:t>
+            </w:r>
+            <w:proofErr w:type="gramEnd"/>
+            <w:r>
+              <w:rPr>
+                <w:rFonts w:ascii="TH SarabunPSK" w:hAnsi="TH SarabunPSK" w:cs="TH SarabunPSK"/>
+                <w:sz w:val="32"/>
+                <w:szCs w:val="32"/>
+                <w:lang w:bidi="th-TH"/>
+              </w:rPr>
+              <w:t xml:space="preserve"> the users updated on their reported incidents.</w:t>
             </w:r>
           </w:p>
         </w:tc>
@@ -2872,7 +4144,7 @@
           <w:p>
             <w:pPr>
               <w:rPr>
-                <w:rFonts w:ascii="TH SarabunPSK" w:hAnsi="TH SarabunPSK" w:cs="TH SarabunPSK" w:hint="cs"/>
+                <w:rFonts w:ascii="TH SarabunPSK" w:hAnsi="TH SarabunPSK" w:cs="TH SarabunPSK"/>
                 <w:b/>
                 <w:bCs/>
                 <w:sz w:val="32"/>
@@ -2971,13 +4243,23 @@
               </w:rPr>
               <w:t xml:space="preserve">มีการเรียกใช้ </w:t>
             </w:r>
-            <w:r>
-              <w:rPr>
-                <w:rFonts w:ascii="TH SarabunPSK" w:hAnsi="TH SarabunPSK" w:cs="TH SarabunPSK"/>
-                <w:sz w:val="32"/>
-                <w:szCs w:val="32"/>
-              </w:rPr>
-              <w:t xml:space="preserve">api </w:t>
+            <w:proofErr w:type="spellStart"/>
+            <w:r>
+              <w:rPr>
+                <w:rFonts w:ascii="TH SarabunPSK" w:hAnsi="TH SarabunPSK" w:cs="TH SarabunPSK"/>
+                <w:sz w:val="32"/>
+                <w:szCs w:val="32"/>
+              </w:rPr>
+              <w:t>api</w:t>
+            </w:r>
+            <w:proofErr w:type="spellEnd"/>
+            <w:r>
+              <w:rPr>
+                <w:rFonts w:ascii="TH SarabunPSK" w:hAnsi="TH SarabunPSK" w:cs="TH SarabunPSK"/>
+                <w:sz w:val="32"/>
+                <w:szCs w:val="32"/>
+              </w:rPr>
+              <w:t xml:space="preserve"> </w:t>
             </w:r>
             <w:r>
               <w:rPr>
@@ -3072,7 +4354,7 @@
             <w:pPr>
               <w:jc w:val="center"/>
               <w:rPr>
-                <w:rFonts w:ascii="TH SarabunPSK" w:hAnsi="TH SarabunPSK" w:cs="TH SarabunPSK" w:hint="cs"/>
+                <w:rFonts w:ascii="TH SarabunPSK" w:hAnsi="TH SarabunPSK" w:cs="TH SarabunPSK"/>
                 <w:b/>
                 <w:bCs/>
                 <w:sz w:val="32"/>
@@ -3337,13 +4619,23 @@
               </w:rPr>
               <w:t>ด้วย /</w:t>
             </w:r>
-            <w:r>
-              <w:rPr>
-                <w:rFonts w:ascii="TH SarabunPSK" w:hAnsi="TH SarabunPSK" w:cs="TH SarabunPSK"/>
-                <w:sz w:val="32"/>
-                <w:szCs w:val="32"/>
-              </w:rPr>
-              <w:t xml:space="preserve">api/reports/admin </w:t>
+            <w:proofErr w:type="spellStart"/>
+            <w:r>
+              <w:rPr>
+                <w:rFonts w:ascii="TH SarabunPSK" w:hAnsi="TH SarabunPSK" w:cs="TH SarabunPSK"/>
+                <w:sz w:val="32"/>
+                <w:szCs w:val="32"/>
+              </w:rPr>
+              <w:t>api</w:t>
+            </w:r>
+            <w:proofErr w:type="spellEnd"/>
+            <w:r>
+              <w:rPr>
+                <w:rFonts w:ascii="TH SarabunPSK" w:hAnsi="TH SarabunPSK" w:cs="TH SarabunPSK"/>
+                <w:sz w:val="32"/>
+                <w:szCs w:val="32"/>
+              </w:rPr>
+              <w:t xml:space="preserve">/reports/admin </w:t>
             </w:r>
             <w:r>
               <w:rPr>
@@ -3633,9 +4925,11 @@
         <w:tc>
           <w:tcPr>
             <w:tcW w:w="1417" w:type="dxa"/>
-          </w:tcPr>
-          <w:p>
-            <w:pPr>
+            <w:vAlign w:val="center"/>
+          </w:tcPr>
+          <w:p>
+            <w:pPr>
+              <w:jc w:val="center"/>
               <w:rPr>
                 <w:rFonts w:ascii="TH SarabunPSK" w:hAnsi="TH SarabunPSK" w:cs="TH SarabunPSK"/>
                 <w:sz w:val="32"/>
@@ -3740,13 +5034,23 @@
               </w:rPr>
               <w:t>ด้วย /</w:t>
             </w:r>
-            <w:r>
-              <w:rPr>
-                <w:rFonts w:ascii="TH SarabunPSK" w:hAnsi="TH SarabunPSK" w:cs="TH SarabunPSK"/>
-                <w:sz w:val="32"/>
-                <w:szCs w:val="32"/>
-              </w:rPr>
-              <w:t>api/reports/admin</w:t>
+            <w:proofErr w:type="spellStart"/>
+            <w:r>
+              <w:rPr>
+                <w:rFonts w:ascii="TH SarabunPSK" w:hAnsi="TH SarabunPSK" w:cs="TH SarabunPSK"/>
+                <w:sz w:val="32"/>
+                <w:szCs w:val="32"/>
+              </w:rPr>
+              <w:t>api</w:t>
+            </w:r>
+            <w:proofErr w:type="spellEnd"/>
+            <w:r>
+              <w:rPr>
+                <w:rFonts w:ascii="TH SarabunPSK" w:hAnsi="TH SarabunPSK" w:cs="TH SarabunPSK"/>
+                <w:sz w:val="32"/>
+                <w:szCs w:val="32"/>
+              </w:rPr>
+              <w:t>/reports/admin</w:t>
             </w:r>
           </w:p>
         </w:tc>
@@ -3770,7 +5074,27 @@
                 <w:szCs w:val="32"/>
                 <w:lang w:bidi="th-TH"/>
               </w:rPr>
-              <w:t>Query: ?status=PENDING</w:t>
+              <w:t>Query</w:t>
+            </w:r>
+            <w:proofErr w:type="gramStart"/>
+            <w:r>
+              <w:rPr>
+                <w:rFonts w:ascii="TH SarabunPSK" w:hAnsi="TH SarabunPSK" w:cs="TH SarabunPSK"/>
+                <w:sz w:val="32"/>
+                <w:szCs w:val="32"/>
+                <w:lang w:bidi="th-TH"/>
+              </w:rPr>
+              <w:t>: ?status</w:t>
+            </w:r>
+            <w:proofErr w:type="gramEnd"/>
+            <w:r>
+              <w:rPr>
+                <w:rFonts w:ascii="TH SarabunPSK" w:hAnsi="TH SarabunPSK" w:cs="TH SarabunPSK"/>
+                <w:sz w:val="32"/>
+                <w:szCs w:val="32"/>
+                <w:lang w:bidi="th-TH"/>
+              </w:rPr>
+              <w:t>=PENDING</w:t>
             </w:r>
           </w:p>
         </w:tc>
@@ -3918,13 +5242,65 @@
               <w:t>เท่านั้น</w:t>
             </w:r>
           </w:p>
+          <w:p>
+            <w:pPr>
+              <w:rPr>
+                <w:rFonts w:ascii="TH SarabunPSK" w:hAnsi="TH SarabunPSK" w:cs="TH SarabunPSK"/>
+                <w:sz w:val="32"/>
+                <w:szCs w:val="32"/>
+                <w:lang w:bidi="th-TH"/>
+              </w:rPr>
+            </w:pPr>
+          </w:p>
+          <w:p>
+            <w:pPr>
+              <w:rPr>
+                <w:rFonts w:ascii="TH SarabunPSK" w:hAnsi="TH SarabunPSK" w:cs="TH SarabunPSK"/>
+                <w:sz w:val="32"/>
+                <w:szCs w:val="32"/>
+                <w:lang w:bidi="th-TH"/>
+              </w:rPr>
+            </w:pPr>
+          </w:p>
+          <w:p>
+            <w:pPr>
+              <w:rPr>
+                <w:rFonts w:ascii="TH SarabunPSK" w:hAnsi="TH SarabunPSK" w:cs="TH SarabunPSK"/>
+                <w:sz w:val="32"/>
+                <w:szCs w:val="32"/>
+                <w:lang w:bidi="th-TH"/>
+              </w:rPr>
+            </w:pPr>
+          </w:p>
+          <w:p>
+            <w:pPr>
+              <w:rPr>
+                <w:rFonts w:ascii="TH SarabunPSK" w:hAnsi="TH SarabunPSK" w:cs="TH SarabunPSK"/>
+                <w:sz w:val="32"/>
+                <w:szCs w:val="32"/>
+                <w:lang w:bidi="th-TH"/>
+              </w:rPr>
+            </w:pPr>
+          </w:p>
+          <w:p>
+            <w:pPr>
+              <w:rPr>
+                <w:rFonts w:ascii="TH SarabunPSK" w:hAnsi="TH SarabunPSK" w:cs="TH SarabunPSK"/>
+                <w:sz w:val="32"/>
+                <w:szCs w:val="32"/>
+                <w:lang w:bidi="th-TH"/>
+              </w:rPr>
+            </w:pPr>
+          </w:p>
         </w:tc>
         <w:tc>
           <w:tcPr>
             <w:tcW w:w="1417" w:type="dxa"/>
-          </w:tcPr>
-          <w:p>
-            <w:pPr>
+            <w:vAlign w:val="center"/>
+          </w:tcPr>
+          <w:p>
+            <w:pPr>
+              <w:jc w:val="center"/>
               <w:rPr>
                 <w:rFonts w:ascii="TH SarabunPSK" w:hAnsi="TH SarabunPSK" w:cs="TH SarabunPSK"/>
                 <w:sz w:val="32"/>
@@ -4091,7 +5467,7 @@
             <w:pPr>
               <w:jc w:val="center"/>
               <w:rPr>
-                <w:rFonts w:ascii="TH SarabunPSK" w:hAnsi="TH SarabunPSK" w:cs="TH SarabunPSK" w:hint="cs"/>
+                <w:rFonts w:ascii="TH SarabunPSK" w:hAnsi="TH SarabunPSK" w:cs="TH SarabunPSK"/>
                 <w:b/>
                 <w:bCs/>
                 <w:sz w:val="32"/>
@@ -4356,13 +5732,23 @@
               </w:rPr>
               <w:t>ด้วย /</w:t>
             </w:r>
-            <w:r>
-              <w:rPr>
-                <w:rFonts w:ascii="TH SarabunPSK" w:hAnsi="TH SarabunPSK" w:cs="TH SarabunPSK"/>
-                <w:sz w:val="32"/>
-                <w:szCs w:val="32"/>
-              </w:rPr>
-              <w:t>api/reports/admin/{id}</w:t>
+            <w:proofErr w:type="spellStart"/>
+            <w:r>
+              <w:rPr>
+                <w:rFonts w:ascii="TH SarabunPSK" w:hAnsi="TH SarabunPSK" w:cs="TH SarabunPSK"/>
+                <w:sz w:val="32"/>
+                <w:szCs w:val="32"/>
+              </w:rPr>
+              <w:t>api</w:t>
+            </w:r>
+            <w:proofErr w:type="spellEnd"/>
+            <w:r>
+              <w:rPr>
+                <w:rFonts w:ascii="TH SarabunPSK" w:hAnsi="TH SarabunPSK" w:cs="TH SarabunPSK"/>
+                <w:sz w:val="32"/>
+                <w:szCs w:val="32"/>
+              </w:rPr>
+              <w:t>/reports/admin/{id}</w:t>
             </w:r>
           </w:p>
         </w:tc>
@@ -4634,9 +6020,11 @@
         <w:tc>
           <w:tcPr>
             <w:tcW w:w="1417" w:type="dxa"/>
-          </w:tcPr>
-          <w:p>
-            <w:pPr>
+            <w:vAlign w:val="center"/>
+          </w:tcPr>
+          <w:p>
+            <w:pPr>
+              <w:jc w:val="center"/>
               <w:rPr>
                 <w:rFonts w:ascii="TH SarabunPSK" w:hAnsi="TH SarabunPSK" w:cs="TH SarabunPSK"/>
                 <w:sz w:val="32"/>
@@ -4741,13 +6129,23 @@
               </w:rPr>
               <w:t>ด้วย /</w:t>
             </w:r>
-            <w:r>
-              <w:rPr>
-                <w:rFonts w:ascii="TH SarabunPSK" w:hAnsi="TH SarabunPSK" w:cs="TH SarabunPSK"/>
-                <w:sz w:val="32"/>
-                <w:szCs w:val="32"/>
-              </w:rPr>
-              <w:t>api/reports/admin/{id}</w:t>
+            <w:proofErr w:type="spellStart"/>
+            <w:r>
+              <w:rPr>
+                <w:rFonts w:ascii="TH SarabunPSK" w:hAnsi="TH SarabunPSK" w:cs="TH SarabunPSK"/>
+                <w:sz w:val="32"/>
+                <w:szCs w:val="32"/>
+              </w:rPr>
+              <w:t>api</w:t>
+            </w:r>
+            <w:proofErr w:type="spellEnd"/>
+            <w:r>
+              <w:rPr>
+                <w:rFonts w:ascii="TH SarabunPSK" w:hAnsi="TH SarabunPSK" w:cs="TH SarabunPSK"/>
+                <w:sz w:val="32"/>
+                <w:szCs w:val="32"/>
+              </w:rPr>
+              <w:t>/reports/admin/{id}</w:t>
             </w:r>
           </w:p>
         </w:tc>
@@ -4894,9 +6292,11 @@
         <w:tc>
           <w:tcPr>
             <w:tcW w:w="1417" w:type="dxa"/>
-          </w:tcPr>
-          <w:p>
-            <w:pPr>
+            <w:vAlign w:val="center"/>
+          </w:tcPr>
+          <w:p>
+            <w:pPr>
+              <w:jc w:val="center"/>
               <w:rPr>
                 <w:rFonts w:ascii="TH SarabunPSK" w:hAnsi="TH SarabunPSK" w:cs="TH SarabunPSK"/>
                 <w:sz w:val="32"/>
@@ -5001,13 +6401,23 @@
               </w:rPr>
               <w:t>ด้วย /</w:t>
             </w:r>
-            <w:r>
-              <w:rPr>
-                <w:rFonts w:ascii="TH SarabunPSK" w:hAnsi="TH SarabunPSK" w:cs="TH SarabunPSK"/>
-                <w:sz w:val="32"/>
-                <w:szCs w:val="32"/>
-              </w:rPr>
-              <w:t>api/reports/admin/{id}/status</w:t>
+            <w:proofErr w:type="spellStart"/>
+            <w:r>
+              <w:rPr>
+                <w:rFonts w:ascii="TH SarabunPSK" w:hAnsi="TH SarabunPSK" w:cs="TH SarabunPSK"/>
+                <w:sz w:val="32"/>
+                <w:szCs w:val="32"/>
+              </w:rPr>
+              <w:t>api</w:t>
+            </w:r>
+            <w:proofErr w:type="spellEnd"/>
+            <w:r>
+              <w:rPr>
+                <w:rFonts w:ascii="TH SarabunPSK" w:hAnsi="TH SarabunPSK" w:cs="TH SarabunPSK"/>
+                <w:sz w:val="32"/>
+                <w:szCs w:val="32"/>
+              </w:rPr>
+              <w:t>/reports/admin/{id}/status</w:t>
             </w:r>
           </w:p>
         </w:tc>
@@ -5031,7 +6441,183 @@
                 <w:szCs w:val="32"/>
                 <w:lang w:bidi="th-TH"/>
               </w:rPr>
-              <w:t xml:space="preserve">Path: id="{REPORT_ID}" </w:t>
+              <w:t>Path: id</w:t>
+            </w:r>
+            <w:proofErr w:type="gramStart"/>
+            <w:r>
+              <w:rPr>
+                <w:rFonts w:ascii="TH SarabunPSK" w:hAnsi="TH SarabunPSK" w:cs="TH SarabunPSK"/>
+                <w:sz w:val="32"/>
+                <w:szCs w:val="32"/>
+                <w:lang w:bidi="th-TH"/>
+              </w:rPr>
+              <w:t>="{</w:t>
+            </w:r>
+            <w:proofErr w:type="gramEnd"/>
+            <w:r>
+              <w:rPr>
+                <w:rFonts w:ascii="TH SarabunPSK" w:hAnsi="TH SarabunPSK" w:cs="TH SarabunPSK"/>
+                <w:sz w:val="32"/>
+                <w:szCs w:val="32"/>
+                <w:lang w:bidi="th-TH"/>
+              </w:rPr>
+              <w:t>REPORT_</w:t>
+            </w:r>
+            <w:proofErr w:type="gramStart"/>
+            <w:r>
+              <w:rPr>
+                <w:rFonts w:ascii="TH SarabunPSK" w:hAnsi="TH SarabunPSK" w:cs="TH SarabunPSK"/>
+                <w:sz w:val="32"/>
+                <w:szCs w:val="32"/>
+                <w:lang w:bidi="th-TH"/>
+              </w:rPr>
+              <w:t xml:space="preserve">ID}" </w:t>
+            </w:r>
+            <w:r>
+              <w:rPr>
+                <w:rFonts w:ascii="TH SarabunPSK" w:hAnsi="TH SarabunPSK" w:cs="TH SarabunPSK"/>
+                <w:sz w:val="32"/>
+                <w:szCs w:val="32"/>
+                <w:cs/>
+                <w:lang w:bidi="th-TH"/>
+              </w:rPr>
+              <w:t>และ</w:t>
+            </w:r>
+            <w:proofErr w:type="gramEnd"/>
+            <w:r>
+              <w:rPr>
+                <w:rFonts w:ascii="TH SarabunPSK" w:hAnsi="TH SarabunPSK" w:cs="TH SarabunPSK"/>
+                <w:sz w:val="32"/>
+                <w:szCs w:val="32"/>
+                <w:cs/>
+                <w:lang w:bidi="th-TH"/>
+              </w:rPr>
+              <w:t xml:space="preserve"> </w:t>
+            </w:r>
+            <w:r>
+              <w:rPr>
+                <w:rFonts w:ascii="TH SarabunPSK" w:hAnsi="TH SarabunPSK" w:cs="TH SarabunPSK"/>
+                <w:sz w:val="32"/>
+                <w:szCs w:val="32"/>
+                <w:lang w:bidi="th-TH"/>
+              </w:rPr>
+              <w:t xml:space="preserve">Body: </w:t>
+            </w:r>
+            <w:proofErr w:type="gramStart"/>
+            <w:r>
+              <w:rPr>
+                <w:rFonts w:ascii="TH SarabunPSK" w:hAnsi="TH SarabunPSK" w:cs="TH SarabunPSK"/>
+                <w:sz w:val="32"/>
+                <w:szCs w:val="32"/>
+                <w:lang w:bidi="th-TH"/>
+              </w:rPr>
+              <w:t>{ "</w:t>
+            </w:r>
+            <w:proofErr w:type="gramEnd"/>
+            <w:r>
+              <w:rPr>
+                <w:rFonts w:ascii="TH SarabunPSK" w:hAnsi="TH SarabunPSK" w:cs="TH SarabunPSK"/>
+                <w:sz w:val="32"/>
+                <w:szCs w:val="32"/>
+                <w:lang w:bidi="th-TH"/>
+              </w:rPr>
+              <w:t>status": "APPROVED</w:t>
+            </w:r>
+            <w:proofErr w:type="gramStart"/>
+            <w:r>
+              <w:rPr>
+                <w:rFonts w:ascii="TH SarabunPSK" w:hAnsi="TH SarabunPSK" w:cs="TH SarabunPSK"/>
+                <w:sz w:val="32"/>
+                <w:szCs w:val="32"/>
+                <w:lang w:bidi="th-TH"/>
+              </w:rPr>
+              <w:t>" }</w:t>
+            </w:r>
+            <w:proofErr w:type="gramEnd"/>
+          </w:p>
+        </w:tc>
+        <w:tc>
+          <w:tcPr>
+            <w:tcW w:w="2023" w:type="dxa"/>
+          </w:tcPr>
+          <w:p>
+            <w:pPr>
+              <w:rPr>
+                <w:rFonts w:ascii="TH SarabunPSK" w:hAnsi="TH SarabunPSK" w:cs="TH SarabunPSK"/>
+                <w:sz w:val="32"/>
+                <w:szCs w:val="32"/>
+                <w:cs/>
+                <w:lang w:bidi="th-TH"/>
+              </w:rPr>
+            </w:pPr>
+            <w:r>
+              <w:rPr>
+                <w:rFonts w:ascii="TH SarabunPSK" w:hAnsi="TH SarabunPSK" w:cs="TH SarabunPSK"/>
+                <w:sz w:val="32"/>
+                <w:szCs w:val="32"/>
+                <w:lang w:bidi="th-TH"/>
+              </w:rPr>
+              <w:t xml:space="preserve">HTTP </w:t>
+            </w:r>
+            <w:r>
+              <w:rPr>
+                <w:rFonts w:ascii="TH SarabunPSK" w:hAnsi="TH SarabunPSK" w:cs="TH SarabunPSK"/>
+                <w:sz w:val="32"/>
+                <w:szCs w:val="32"/>
+                <w:cs/>
+                <w:lang w:bidi="th-TH"/>
+              </w:rPr>
+              <w:t>200</w:t>
+            </w:r>
+            <w:r>
+              <w:rPr>
+                <w:rFonts w:ascii="TH SarabunPSK" w:hAnsi="TH SarabunPSK" w:cs="TH SarabunPSK"/>
+                <w:sz w:val="32"/>
+                <w:szCs w:val="32"/>
+                <w:lang w:bidi="th-TH"/>
+              </w:rPr>
+              <w:t xml:space="preserve">, </w:t>
+            </w:r>
+            <w:proofErr w:type="spellStart"/>
+            <w:proofErr w:type="gramStart"/>
+            <w:r>
+              <w:rPr>
+                <w:rFonts w:ascii="TH SarabunPSK" w:hAnsi="TH SarabunPSK" w:cs="TH SarabunPSK"/>
+                <w:sz w:val="32"/>
+                <w:szCs w:val="32"/>
+                <w:lang w:bidi="th-TH"/>
+              </w:rPr>
+              <w:t>data.status</w:t>
+            </w:r>
+            <w:proofErr w:type="spellEnd"/>
+            <w:proofErr w:type="gramEnd"/>
+            <w:r>
+              <w:rPr>
+                <w:rFonts w:ascii="TH SarabunPSK" w:hAnsi="TH SarabunPSK" w:cs="TH SarabunPSK"/>
+                <w:sz w:val="32"/>
+                <w:szCs w:val="32"/>
+                <w:lang w:bidi="th-TH"/>
+              </w:rPr>
+              <w:t xml:space="preserve"> </w:t>
+            </w:r>
+            <w:r>
+              <w:rPr>
+                <w:rFonts w:ascii="TH SarabunPSK" w:hAnsi="TH SarabunPSK" w:cs="TH SarabunPSK"/>
+                <w:sz w:val="32"/>
+                <w:szCs w:val="32"/>
+                <w:cs/>
+                <w:lang w:bidi="th-TH"/>
+              </w:rPr>
+              <w:t>เปลี่ยนเป็น "</w:t>
+            </w:r>
+            <w:r>
+              <w:rPr>
+                <w:rFonts w:ascii="TH SarabunPSK" w:hAnsi="TH SarabunPSK" w:cs="TH SarabunPSK"/>
+                <w:sz w:val="32"/>
+                <w:szCs w:val="32"/>
+                <w:lang w:bidi="th-TH"/>
+              </w:rPr>
+              <w:t xml:space="preserve">APPROVED" </w:t>
             </w:r>
             <w:r>
               <w:rPr>
@@ -5043,96 +6629,25 @@
               </w:rPr>
               <w:t xml:space="preserve">และ </w:t>
             </w:r>
-            <w:r>
-              <w:rPr>
-                <w:rFonts w:ascii="TH SarabunPSK" w:hAnsi="TH SarabunPSK" w:cs="TH SarabunPSK"/>
-                <w:sz w:val="32"/>
-                <w:szCs w:val="32"/>
-                <w:lang w:bidi="th-TH"/>
-              </w:rPr>
-              <w:t>Body: { "status": "APPROVED" }</w:t>
-            </w:r>
-          </w:p>
-        </w:tc>
-        <w:tc>
-          <w:tcPr>
-            <w:tcW w:w="2023" w:type="dxa"/>
-          </w:tcPr>
-          <w:p>
-            <w:pPr>
-              <w:rPr>
-                <w:rFonts w:ascii="TH SarabunPSK" w:hAnsi="TH SarabunPSK" w:cs="TH SarabunPSK"/>
-                <w:sz w:val="32"/>
-                <w:szCs w:val="32"/>
-                <w:cs/>
-                <w:lang w:bidi="th-TH"/>
-              </w:rPr>
-            </w:pPr>
-            <w:r>
-              <w:rPr>
-                <w:rFonts w:ascii="TH SarabunPSK" w:hAnsi="TH SarabunPSK" w:cs="TH SarabunPSK"/>
-                <w:sz w:val="32"/>
-                <w:szCs w:val="32"/>
-                <w:lang w:bidi="th-TH"/>
-              </w:rPr>
-              <w:t xml:space="preserve">HTTP </w:t>
-            </w:r>
-            <w:r>
-              <w:rPr>
-                <w:rFonts w:ascii="TH SarabunPSK" w:hAnsi="TH SarabunPSK" w:cs="TH SarabunPSK"/>
-                <w:sz w:val="32"/>
-                <w:szCs w:val="32"/>
-                <w:cs/>
-                <w:lang w:bidi="th-TH"/>
-              </w:rPr>
-              <w:t>200</w:t>
-            </w:r>
-            <w:r>
-              <w:rPr>
-                <w:rFonts w:ascii="TH SarabunPSK" w:hAnsi="TH SarabunPSK" w:cs="TH SarabunPSK"/>
-                <w:sz w:val="32"/>
-                <w:szCs w:val="32"/>
-                <w:lang w:bidi="th-TH"/>
-              </w:rPr>
-              <w:t xml:space="preserve">, data.status </w:t>
-            </w:r>
-            <w:r>
-              <w:rPr>
-                <w:rFonts w:ascii="TH SarabunPSK" w:hAnsi="TH SarabunPSK" w:cs="TH SarabunPSK"/>
-                <w:sz w:val="32"/>
-                <w:szCs w:val="32"/>
-                <w:cs/>
-                <w:lang w:bidi="th-TH"/>
-              </w:rPr>
-              <w:t>เปลี่ยนเป็น "</w:t>
-            </w:r>
-            <w:r>
-              <w:rPr>
-                <w:rFonts w:ascii="TH SarabunPSK" w:hAnsi="TH SarabunPSK" w:cs="TH SarabunPSK"/>
-                <w:sz w:val="32"/>
-                <w:szCs w:val="32"/>
-                <w:lang w:bidi="th-TH"/>
-              </w:rPr>
-              <w:t xml:space="preserve">APPROVED" </w:t>
-            </w:r>
-            <w:r>
-              <w:rPr>
-                <w:rFonts w:ascii="TH SarabunPSK" w:hAnsi="TH SarabunPSK" w:cs="TH SarabunPSK"/>
-                <w:sz w:val="32"/>
-                <w:szCs w:val="32"/>
-                <w:cs/>
-                <w:lang w:bidi="th-TH"/>
-              </w:rPr>
-              <w:t xml:space="preserve">และ </w:t>
-            </w:r>
-            <w:r>
-              <w:rPr>
-                <w:rFonts w:ascii="TH SarabunPSK" w:hAnsi="TH SarabunPSK" w:cs="TH SarabunPSK"/>
-                <w:sz w:val="32"/>
-                <w:szCs w:val="32"/>
-                <w:lang w:bidi="th-TH"/>
-              </w:rPr>
-              <w:t xml:space="preserve">updatedAt </w:t>
+            <w:proofErr w:type="spellStart"/>
+            <w:r>
+              <w:rPr>
+                <w:rFonts w:ascii="TH SarabunPSK" w:hAnsi="TH SarabunPSK" w:cs="TH SarabunPSK"/>
+                <w:sz w:val="32"/>
+                <w:szCs w:val="32"/>
+                <w:lang w:bidi="th-TH"/>
+              </w:rPr>
+              <w:t>updatedAt</w:t>
+            </w:r>
+            <w:proofErr w:type="spellEnd"/>
+            <w:r>
+              <w:rPr>
+                <w:rFonts w:ascii="TH SarabunPSK" w:hAnsi="TH SarabunPSK" w:cs="TH SarabunPSK"/>
+                <w:sz w:val="32"/>
+                <w:szCs w:val="32"/>
+                <w:lang w:bidi="th-TH"/>
+              </w:rPr>
+              <w:t xml:space="preserve"> </w:t>
             </w:r>
             <w:r>
               <w:rPr>
@@ -5167,7 +6682,29 @@
                 <w:szCs w:val="32"/>
                 <w:lang w:bidi="th-TH"/>
               </w:rPr>
-              <w:t xml:space="preserve">HTTP 200, data.status </w:t>
+              <w:t xml:space="preserve">HTTP 200, </w:t>
+            </w:r>
+            <w:proofErr w:type="spellStart"/>
+            <w:proofErr w:type="gramStart"/>
+            <w:r>
+              <w:rPr>
+                <w:rFonts w:ascii="TH SarabunPSK" w:hAnsi="TH SarabunPSK" w:cs="TH SarabunPSK"/>
+                <w:sz w:val="32"/>
+                <w:szCs w:val="32"/>
+                <w:lang w:bidi="th-TH"/>
+              </w:rPr>
+              <w:t>data.status</w:t>
+            </w:r>
+            <w:proofErr w:type="spellEnd"/>
+            <w:proofErr w:type="gramEnd"/>
+            <w:r>
+              <w:rPr>
+                <w:rFonts w:ascii="TH SarabunPSK" w:hAnsi="TH SarabunPSK" w:cs="TH SarabunPSK"/>
+                <w:sz w:val="32"/>
+                <w:szCs w:val="32"/>
+                <w:lang w:bidi="th-TH"/>
+              </w:rPr>
+              <w:t xml:space="preserve"> </w:t>
             </w:r>
             <w:r>
               <w:rPr>
@@ -5198,14 +6735,25 @@
               </w:rPr>
               <w:t xml:space="preserve">และ </w:t>
             </w:r>
-            <w:r>
-              <w:rPr>
-                <w:rFonts w:ascii="TH SarabunPSK" w:hAnsi="TH SarabunPSK" w:cs="TH SarabunPSK"/>
-                <w:sz w:val="32"/>
-                <w:szCs w:val="32"/>
-                <w:lang w:bidi="th-TH"/>
-              </w:rPr>
-              <w:t xml:space="preserve">updatedAt </w:t>
+            <w:proofErr w:type="spellStart"/>
+            <w:r>
+              <w:rPr>
+                <w:rFonts w:ascii="TH SarabunPSK" w:hAnsi="TH SarabunPSK" w:cs="TH SarabunPSK"/>
+                <w:sz w:val="32"/>
+                <w:szCs w:val="32"/>
+                <w:lang w:bidi="th-TH"/>
+              </w:rPr>
+              <w:t>updatedAt</w:t>
+            </w:r>
+            <w:proofErr w:type="spellEnd"/>
+            <w:r>
+              <w:rPr>
+                <w:rFonts w:ascii="TH SarabunPSK" w:hAnsi="TH SarabunPSK" w:cs="TH SarabunPSK"/>
+                <w:sz w:val="32"/>
+                <w:szCs w:val="32"/>
+                <w:lang w:bidi="th-TH"/>
+              </w:rPr>
+              <w:t xml:space="preserve"> </w:t>
             </w:r>
             <w:r>
               <w:rPr>
@@ -5222,9 +6770,11 @@
         <w:tc>
           <w:tcPr>
             <w:tcW w:w="1417" w:type="dxa"/>
-          </w:tcPr>
-          <w:p>
-            <w:pPr>
+            <w:vAlign w:val="center"/>
+          </w:tcPr>
+          <w:p>
+            <w:pPr>
+              <w:jc w:val="center"/>
               <w:rPr>
                 <w:rFonts w:ascii="TH SarabunPSK" w:hAnsi="TH SarabunPSK" w:cs="TH SarabunPSK"/>
                 <w:sz w:val="32"/>
@@ -5329,13 +6879,23 @@
               </w:rPr>
               <w:t>ด้วย /</w:t>
             </w:r>
-            <w:r>
-              <w:rPr>
-                <w:rFonts w:ascii="TH SarabunPSK" w:hAnsi="TH SarabunPSK" w:cs="TH SarabunPSK"/>
-                <w:sz w:val="32"/>
-                <w:szCs w:val="32"/>
-              </w:rPr>
-              <w:t>api/reports/admin/{id}/status</w:t>
+            <w:proofErr w:type="spellStart"/>
+            <w:r>
+              <w:rPr>
+                <w:rFonts w:ascii="TH SarabunPSK" w:hAnsi="TH SarabunPSK" w:cs="TH SarabunPSK"/>
+                <w:sz w:val="32"/>
+                <w:szCs w:val="32"/>
+              </w:rPr>
+              <w:t>api</w:t>
+            </w:r>
+            <w:proofErr w:type="spellEnd"/>
+            <w:r>
+              <w:rPr>
+                <w:rFonts w:ascii="TH SarabunPSK" w:hAnsi="TH SarabunPSK" w:cs="TH SarabunPSK"/>
+                <w:sz w:val="32"/>
+                <w:szCs w:val="32"/>
+              </w:rPr>
+              <w:t>/reports/admin/{id}/status</w:t>
             </w:r>
           </w:p>
         </w:tc>
@@ -5359,27 +6919,99 @@
                 <w:szCs w:val="32"/>
                 <w:lang w:bidi="th-TH"/>
               </w:rPr>
-              <w:t xml:space="preserve">Path: id="{REPORT_ID}" </w:t>
-            </w:r>
-            <w:r>
-              <w:rPr>
-                <w:rFonts w:ascii="TH SarabunPSK" w:hAnsi="TH SarabunPSK" w:cs="TH SarabunPSK"/>
-                <w:sz w:val="32"/>
-                <w:szCs w:val="32"/>
-                <w:cs/>
-                <w:lang w:bidi="th-TH"/>
-              </w:rPr>
-              <w:t xml:space="preserve">และ </w:t>
-            </w:r>
-            <w:r>
-              <w:rPr>
-                <w:rFonts w:ascii="TH SarabunPSK" w:hAnsi="TH SarabunPSK" w:cs="TH SarabunPSK"/>
-                <w:sz w:val="32"/>
-                <w:szCs w:val="32"/>
-                <w:lang w:bidi="th-TH"/>
-              </w:rPr>
-              <w:t>Body: { "status": "REJECTED" }</w:t>
-            </w:r>
+              <w:t>Path: id</w:t>
+            </w:r>
+            <w:proofErr w:type="gramStart"/>
+            <w:r>
+              <w:rPr>
+                <w:rFonts w:ascii="TH SarabunPSK" w:hAnsi="TH SarabunPSK" w:cs="TH SarabunPSK"/>
+                <w:sz w:val="32"/>
+                <w:szCs w:val="32"/>
+                <w:lang w:bidi="th-TH"/>
+              </w:rPr>
+              <w:t>="{</w:t>
+            </w:r>
+            <w:proofErr w:type="gramEnd"/>
+            <w:r>
+              <w:rPr>
+                <w:rFonts w:ascii="TH SarabunPSK" w:hAnsi="TH SarabunPSK" w:cs="TH SarabunPSK"/>
+                <w:sz w:val="32"/>
+                <w:szCs w:val="32"/>
+                <w:lang w:bidi="th-TH"/>
+              </w:rPr>
+              <w:t>REPORT_</w:t>
+            </w:r>
+            <w:proofErr w:type="gramStart"/>
+            <w:r>
+              <w:rPr>
+                <w:rFonts w:ascii="TH SarabunPSK" w:hAnsi="TH SarabunPSK" w:cs="TH SarabunPSK"/>
+                <w:sz w:val="32"/>
+                <w:szCs w:val="32"/>
+                <w:lang w:bidi="th-TH"/>
+              </w:rPr>
+              <w:t xml:space="preserve">ID}" </w:t>
+            </w:r>
+            <w:r>
+              <w:rPr>
+                <w:rFonts w:ascii="TH SarabunPSK" w:hAnsi="TH SarabunPSK" w:cs="TH SarabunPSK"/>
+                <w:sz w:val="32"/>
+                <w:szCs w:val="32"/>
+                <w:cs/>
+                <w:lang w:bidi="th-TH"/>
+              </w:rPr>
+              <w:t>และ</w:t>
+            </w:r>
+            <w:proofErr w:type="gramEnd"/>
+            <w:r>
+              <w:rPr>
+                <w:rFonts w:ascii="TH SarabunPSK" w:hAnsi="TH SarabunPSK" w:cs="TH SarabunPSK"/>
+                <w:sz w:val="32"/>
+                <w:szCs w:val="32"/>
+                <w:cs/>
+                <w:lang w:bidi="th-TH"/>
+              </w:rPr>
+              <w:t xml:space="preserve"> </w:t>
+            </w:r>
+            <w:r>
+              <w:rPr>
+                <w:rFonts w:ascii="TH SarabunPSK" w:hAnsi="TH SarabunPSK" w:cs="TH SarabunPSK"/>
+                <w:sz w:val="32"/>
+                <w:szCs w:val="32"/>
+                <w:lang w:bidi="th-TH"/>
+              </w:rPr>
+              <w:t xml:space="preserve">Body: </w:t>
+            </w:r>
+            <w:proofErr w:type="gramStart"/>
+            <w:r>
+              <w:rPr>
+                <w:rFonts w:ascii="TH SarabunPSK" w:hAnsi="TH SarabunPSK" w:cs="TH SarabunPSK"/>
+                <w:sz w:val="32"/>
+                <w:szCs w:val="32"/>
+                <w:lang w:bidi="th-TH"/>
+              </w:rPr>
+              <w:t>{ "</w:t>
+            </w:r>
+            <w:proofErr w:type="gramEnd"/>
+            <w:r>
+              <w:rPr>
+                <w:rFonts w:ascii="TH SarabunPSK" w:hAnsi="TH SarabunPSK" w:cs="TH SarabunPSK"/>
+                <w:sz w:val="32"/>
+                <w:szCs w:val="32"/>
+                <w:lang w:bidi="th-TH"/>
+              </w:rPr>
+              <w:t>status": "REJECTED</w:t>
+            </w:r>
+            <w:proofErr w:type="gramStart"/>
+            <w:r>
+              <w:rPr>
+                <w:rFonts w:ascii="TH SarabunPSK" w:hAnsi="TH SarabunPSK" w:cs="TH SarabunPSK"/>
+                <w:sz w:val="32"/>
+                <w:szCs w:val="32"/>
+                <w:lang w:bidi="th-TH"/>
+              </w:rPr>
+              <w:t>" }</w:t>
+            </w:r>
+            <w:proofErr w:type="gramEnd"/>
           </w:p>
         </w:tc>
         <w:tc>
@@ -5421,7 +7053,29 @@
                 <w:szCs w:val="32"/>
                 <w:lang w:bidi="th-TH"/>
               </w:rPr>
-              <w:t xml:space="preserve">, data.status </w:t>
+              <w:t xml:space="preserve">, </w:t>
+            </w:r>
+            <w:proofErr w:type="spellStart"/>
+            <w:proofErr w:type="gramStart"/>
+            <w:r>
+              <w:rPr>
+                <w:rFonts w:ascii="TH SarabunPSK" w:hAnsi="TH SarabunPSK" w:cs="TH SarabunPSK"/>
+                <w:sz w:val="32"/>
+                <w:szCs w:val="32"/>
+                <w:lang w:bidi="th-TH"/>
+              </w:rPr>
+              <w:t>data.status</w:t>
+            </w:r>
+            <w:proofErr w:type="spellEnd"/>
+            <w:proofErr w:type="gramEnd"/>
+            <w:r>
+              <w:rPr>
+                <w:rFonts w:ascii="TH SarabunPSK" w:hAnsi="TH SarabunPSK" w:cs="TH SarabunPSK"/>
+                <w:sz w:val="32"/>
+                <w:szCs w:val="32"/>
+                <w:lang w:bidi="th-TH"/>
+              </w:rPr>
+              <w:t xml:space="preserve"> </w:t>
             </w:r>
             <w:r>
               <w:rPr>
@@ -5465,7 +7119,29 @@
                 <w:szCs w:val="32"/>
                 <w:lang w:bidi="th-TH"/>
               </w:rPr>
-              <w:t xml:space="preserve">HTTP 200, data.status </w:t>
+              <w:t xml:space="preserve">HTTP 200, </w:t>
+            </w:r>
+            <w:proofErr w:type="spellStart"/>
+            <w:proofErr w:type="gramStart"/>
+            <w:r>
+              <w:rPr>
+                <w:rFonts w:ascii="TH SarabunPSK" w:hAnsi="TH SarabunPSK" w:cs="TH SarabunPSK"/>
+                <w:sz w:val="32"/>
+                <w:szCs w:val="32"/>
+                <w:lang w:bidi="th-TH"/>
+              </w:rPr>
+              <w:t>data.status</w:t>
+            </w:r>
+            <w:proofErr w:type="spellEnd"/>
+            <w:proofErr w:type="gramEnd"/>
+            <w:r>
+              <w:rPr>
+                <w:rFonts w:ascii="TH SarabunPSK" w:hAnsi="TH SarabunPSK" w:cs="TH SarabunPSK"/>
+                <w:sz w:val="32"/>
+                <w:szCs w:val="32"/>
+                <w:lang w:bidi="th-TH"/>
+              </w:rPr>
+              <w:t xml:space="preserve"> </w:t>
             </w:r>
             <w:r>
               <w:rPr>
@@ -5491,9 +7167,11 @@
         <w:tc>
           <w:tcPr>
             <w:tcW w:w="1417" w:type="dxa"/>
-          </w:tcPr>
-          <w:p>
-            <w:pPr>
+            <w:vAlign w:val="center"/>
+          </w:tcPr>
+          <w:p>
+            <w:pPr>
+              <w:jc w:val="center"/>
               <w:rPr>
                 <w:rFonts w:ascii="TH SarabunPSK" w:hAnsi="TH SarabunPSK" w:cs="TH SarabunPSK"/>
                 <w:sz w:val="32"/>
@@ -5598,13 +7276,23 @@
               </w:rPr>
               <w:t>ด้วย /</w:t>
             </w:r>
-            <w:r>
-              <w:rPr>
-                <w:rFonts w:ascii="TH SarabunPSK" w:hAnsi="TH SarabunPSK" w:cs="TH SarabunPSK"/>
-                <w:sz w:val="32"/>
-                <w:szCs w:val="32"/>
-              </w:rPr>
-              <w:t>api/reports/admin/{id}/status</w:t>
+            <w:proofErr w:type="spellStart"/>
+            <w:r>
+              <w:rPr>
+                <w:rFonts w:ascii="TH SarabunPSK" w:hAnsi="TH SarabunPSK" w:cs="TH SarabunPSK"/>
+                <w:sz w:val="32"/>
+                <w:szCs w:val="32"/>
+              </w:rPr>
+              <w:t>api</w:t>
+            </w:r>
+            <w:proofErr w:type="spellEnd"/>
+            <w:r>
+              <w:rPr>
+                <w:rFonts w:ascii="TH SarabunPSK" w:hAnsi="TH SarabunPSK" w:cs="TH SarabunPSK"/>
+                <w:sz w:val="32"/>
+                <w:szCs w:val="32"/>
+              </w:rPr>
+              <w:t>/reports/admin/{id}/status</w:t>
             </w:r>
           </w:p>
         </w:tc>
@@ -5628,27 +7316,99 @@
                 <w:szCs w:val="32"/>
                 <w:lang w:bidi="th-TH"/>
               </w:rPr>
-              <w:t xml:space="preserve">Path: id="{REPORT_ID}" </w:t>
-            </w:r>
-            <w:r>
-              <w:rPr>
-                <w:rFonts w:ascii="TH SarabunPSK" w:hAnsi="TH SarabunPSK" w:cs="TH SarabunPSK"/>
-                <w:sz w:val="32"/>
-                <w:szCs w:val="32"/>
-                <w:cs/>
-                <w:lang w:bidi="th-TH"/>
-              </w:rPr>
-              <w:t xml:space="preserve">และ </w:t>
-            </w:r>
-            <w:r>
-              <w:rPr>
-                <w:rFonts w:ascii="TH SarabunPSK" w:hAnsi="TH SarabunPSK" w:cs="TH SarabunPSK"/>
-                <w:sz w:val="32"/>
-                <w:szCs w:val="32"/>
-                <w:lang w:bidi="th-TH"/>
-              </w:rPr>
-              <w:t>Body: { "status": "WAITING" }</w:t>
-            </w:r>
+              <w:t>Path: id</w:t>
+            </w:r>
+            <w:proofErr w:type="gramStart"/>
+            <w:r>
+              <w:rPr>
+                <w:rFonts w:ascii="TH SarabunPSK" w:hAnsi="TH SarabunPSK" w:cs="TH SarabunPSK"/>
+                <w:sz w:val="32"/>
+                <w:szCs w:val="32"/>
+                <w:lang w:bidi="th-TH"/>
+              </w:rPr>
+              <w:t>="{</w:t>
+            </w:r>
+            <w:proofErr w:type="gramEnd"/>
+            <w:r>
+              <w:rPr>
+                <w:rFonts w:ascii="TH SarabunPSK" w:hAnsi="TH SarabunPSK" w:cs="TH SarabunPSK"/>
+                <w:sz w:val="32"/>
+                <w:szCs w:val="32"/>
+                <w:lang w:bidi="th-TH"/>
+              </w:rPr>
+              <w:t>REPORT_</w:t>
+            </w:r>
+            <w:proofErr w:type="gramStart"/>
+            <w:r>
+              <w:rPr>
+                <w:rFonts w:ascii="TH SarabunPSK" w:hAnsi="TH SarabunPSK" w:cs="TH SarabunPSK"/>
+                <w:sz w:val="32"/>
+                <w:szCs w:val="32"/>
+                <w:lang w:bidi="th-TH"/>
+              </w:rPr>
+              <w:t xml:space="preserve">ID}" </w:t>
+            </w:r>
+            <w:r>
+              <w:rPr>
+                <w:rFonts w:ascii="TH SarabunPSK" w:hAnsi="TH SarabunPSK" w:cs="TH SarabunPSK"/>
+                <w:sz w:val="32"/>
+                <w:szCs w:val="32"/>
+                <w:cs/>
+                <w:lang w:bidi="th-TH"/>
+              </w:rPr>
+              <w:t>และ</w:t>
+            </w:r>
+            <w:proofErr w:type="gramEnd"/>
+            <w:r>
+              <w:rPr>
+                <w:rFonts w:ascii="TH SarabunPSK" w:hAnsi="TH SarabunPSK" w:cs="TH SarabunPSK"/>
+                <w:sz w:val="32"/>
+                <w:szCs w:val="32"/>
+                <w:cs/>
+                <w:lang w:bidi="th-TH"/>
+              </w:rPr>
+              <w:t xml:space="preserve"> </w:t>
+            </w:r>
+            <w:r>
+              <w:rPr>
+                <w:rFonts w:ascii="TH SarabunPSK" w:hAnsi="TH SarabunPSK" w:cs="TH SarabunPSK"/>
+                <w:sz w:val="32"/>
+                <w:szCs w:val="32"/>
+                <w:lang w:bidi="th-TH"/>
+              </w:rPr>
+              <w:t xml:space="preserve">Body: </w:t>
+            </w:r>
+            <w:proofErr w:type="gramStart"/>
+            <w:r>
+              <w:rPr>
+                <w:rFonts w:ascii="TH SarabunPSK" w:hAnsi="TH SarabunPSK" w:cs="TH SarabunPSK"/>
+                <w:sz w:val="32"/>
+                <w:szCs w:val="32"/>
+                <w:lang w:bidi="th-TH"/>
+              </w:rPr>
+              <w:t>{ "</w:t>
+            </w:r>
+            <w:proofErr w:type="gramEnd"/>
+            <w:r>
+              <w:rPr>
+                <w:rFonts w:ascii="TH SarabunPSK" w:hAnsi="TH SarabunPSK" w:cs="TH SarabunPSK"/>
+                <w:sz w:val="32"/>
+                <w:szCs w:val="32"/>
+                <w:lang w:bidi="th-TH"/>
+              </w:rPr>
+              <w:t>status": "WAITING</w:t>
+            </w:r>
+            <w:proofErr w:type="gramStart"/>
+            <w:r>
+              <w:rPr>
+                <w:rFonts w:ascii="TH SarabunPSK" w:hAnsi="TH SarabunPSK" w:cs="TH SarabunPSK"/>
+                <w:sz w:val="32"/>
+                <w:szCs w:val="32"/>
+                <w:lang w:bidi="th-TH"/>
+              </w:rPr>
+              <w:t>" }</w:t>
+            </w:r>
+            <w:proofErr w:type="gramEnd"/>
           </w:p>
         </w:tc>
         <w:tc>
@@ -5718,13 +7478,45 @@
               <w:t>HTTP 400, success: false</w:t>
             </w:r>
           </w:p>
+          <w:p>
+            <w:pPr>
+              <w:rPr>
+                <w:rFonts w:ascii="TH SarabunPSK" w:hAnsi="TH SarabunPSK" w:cs="TH SarabunPSK"/>
+                <w:sz w:val="32"/>
+                <w:szCs w:val="32"/>
+                <w:lang w:bidi="th-TH"/>
+              </w:rPr>
+            </w:pPr>
+          </w:p>
+          <w:p>
+            <w:pPr>
+              <w:rPr>
+                <w:rFonts w:ascii="TH SarabunPSK" w:hAnsi="TH SarabunPSK" w:cs="TH SarabunPSK"/>
+                <w:sz w:val="32"/>
+                <w:szCs w:val="32"/>
+                <w:lang w:bidi="th-TH"/>
+              </w:rPr>
+            </w:pPr>
+          </w:p>
+          <w:p>
+            <w:pPr>
+              <w:rPr>
+                <w:rFonts w:ascii="TH SarabunPSK" w:hAnsi="TH SarabunPSK" w:cs="TH SarabunPSK"/>
+                <w:sz w:val="32"/>
+                <w:szCs w:val="32"/>
+                <w:lang w:bidi="th-TH"/>
+              </w:rPr>
+            </w:pPr>
+          </w:p>
         </w:tc>
         <w:tc>
           <w:tcPr>
             <w:tcW w:w="1417" w:type="dxa"/>
-          </w:tcPr>
-          <w:p>
-            <w:pPr>
+            <w:vAlign w:val="center"/>
+          </w:tcPr>
+          <w:p>
+            <w:pPr>
+              <w:jc w:val="center"/>
               <w:rPr>
                 <w:rFonts w:ascii="TH SarabunPSK" w:hAnsi="TH SarabunPSK" w:cs="TH SarabunPSK"/>
                 <w:sz w:val="32"/>
@@ -5842,7 +7634,7 @@
             <w:pPr>
               <w:jc w:val="center"/>
               <w:rPr>
-                <w:rFonts w:ascii="TH SarabunPSK" w:hAnsi="TH SarabunPSK" w:cs="TH SarabunPSK" w:hint="cs"/>
+                <w:rFonts w:ascii="TH SarabunPSK" w:hAnsi="TH SarabunPSK" w:cs="TH SarabunPSK"/>
                 <w:b/>
                 <w:bCs/>
                 <w:sz w:val="32"/>
@@ -6107,13 +7899,23 @@
               </w:rPr>
               <w:t>ด้วย /</w:t>
             </w:r>
-            <w:r>
-              <w:rPr>
-                <w:rFonts w:ascii="TH SarabunPSK" w:hAnsi="TH SarabunPSK" w:cs="TH SarabunPSK"/>
-                <w:sz w:val="32"/>
-                <w:szCs w:val="32"/>
-              </w:rPr>
-              <w:t>api/reports/admin</w:t>
+            <w:proofErr w:type="spellStart"/>
+            <w:r>
+              <w:rPr>
+                <w:rFonts w:ascii="TH SarabunPSK" w:hAnsi="TH SarabunPSK" w:cs="TH SarabunPSK"/>
+                <w:sz w:val="32"/>
+                <w:szCs w:val="32"/>
+              </w:rPr>
+              <w:t>api</w:t>
+            </w:r>
+            <w:proofErr w:type="spellEnd"/>
+            <w:r>
+              <w:rPr>
+                <w:rFonts w:ascii="TH SarabunPSK" w:hAnsi="TH SarabunPSK" w:cs="TH SarabunPSK"/>
+                <w:sz w:val="32"/>
+                <w:szCs w:val="32"/>
+              </w:rPr>
+              <w:t>/reports/admin</w:t>
             </w:r>
           </w:p>
         </w:tc>
@@ -6213,9 +8015,11 @@
         <w:tc>
           <w:tcPr>
             <w:tcW w:w="1417" w:type="dxa"/>
-          </w:tcPr>
-          <w:p>
-            <w:pPr>
+            <w:vAlign w:val="center"/>
+          </w:tcPr>
+          <w:p>
+            <w:pPr>
+              <w:jc w:val="center"/>
               <w:rPr>
                 <w:rFonts w:ascii="TH SarabunPSK" w:hAnsi="TH SarabunPSK" w:cs="TH SarabunPSK"/>
                 <w:sz w:val="32"/>
@@ -6320,13 +8124,23 @@
               </w:rPr>
               <w:t>ด้วย /</w:t>
             </w:r>
-            <w:r>
-              <w:rPr>
-                <w:rFonts w:ascii="TH SarabunPSK" w:hAnsi="TH SarabunPSK" w:cs="TH SarabunPSK"/>
-                <w:sz w:val="32"/>
-                <w:szCs w:val="32"/>
-              </w:rPr>
-              <w:t>api/reports/admin</w:t>
+            <w:proofErr w:type="spellStart"/>
+            <w:r>
+              <w:rPr>
+                <w:rFonts w:ascii="TH SarabunPSK" w:hAnsi="TH SarabunPSK" w:cs="TH SarabunPSK"/>
+                <w:sz w:val="32"/>
+                <w:szCs w:val="32"/>
+              </w:rPr>
+              <w:t>api</w:t>
+            </w:r>
+            <w:proofErr w:type="spellEnd"/>
+            <w:r>
+              <w:rPr>
+                <w:rFonts w:ascii="TH SarabunPSK" w:hAnsi="TH SarabunPSK" w:cs="TH SarabunPSK"/>
+                <w:sz w:val="32"/>
+                <w:szCs w:val="32"/>
+              </w:rPr>
+              <w:t>/reports/admin</w:t>
             </w:r>
           </w:p>
         </w:tc>
@@ -6434,14 +8248,25 @@
               </w:rPr>
               <w:t xml:space="preserve">หรือ </w:t>
             </w:r>
-            <w:r>
-              <w:rPr>
-                <w:rFonts w:ascii="TH SarabunPSK" w:hAnsi="TH SarabunPSK" w:cs="TH SarabunPSK"/>
-                <w:sz w:val="32"/>
-                <w:szCs w:val="32"/>
-                <w:lang w:bidi="th-TH"/>
-              </w:rPr>
-              <w:t>message:"Not authorized, token failed"</w:t>
+            <w:proofErr w:type="spellStart"/>
+            <w:r>
+              <w:rPr>
+                <w:rFonts w:ascii="TH SarabunPSK" w:hAnsi="TH SarabunPSK" w:cs="TH SarabunPSK"/>
+                <w:sz w:val="32"/>
+                <w:szCs w:val="32"/>
+                <w:lang w:bidi="th-TH"/>
+              </w:rPr>
+              <w:t>message:"Not</w:t>
+            </w:r>
+            <w:proofErr w:type="spellEnd"/>
+            <w:r>
+              <w:rPr>
+                <w:rFonts w:ascii="TH SarabunPSK" w:hAnsi="TH SarabunPSK" w:cs="TH SarabunPSK"/>
+                <w:sz w:val="32"/>
+                <w:szCs w:val="32"/>
+                <w:lang w:bidi="th-TH"/>
+              </w:rPr>
+              <w:t xml:space="preserve"> authorized, token failed"</w:t>
             </w:r>
           </w:p>
         </w:tc>
@@ -6466,16 +8291,38 @@
                 <w:szCs w:val="32"/>
                 <w:lang w:bidi="th-TH"/>
               </w:rPr>
-              <w:t>HTTP 401, message:"Not authorized, token failed"</w:t>
+              <w:t xml:space="preserve">HTTP 401, </w:t>
+            </w:r>
+            <w:proofErr w:type="spellStart"/>
+            <w:r>
+              <w:rPr>
+                <w:rFonts w:ascii="TH SarabunPSK" w:hAnsi="TH SarabunPSK" w:cs="TH SarabunPSK"/>
+                <w:sz w:val="32"/>
+                <w:szCs w:val="32"/>
+                <w:lang w:bidi="th-TH"/>
+              </w:rPr>
+              <w:t>message:"Not</w:t>
+            </w:r>
+            <w:proofErr w:type="spellEnd"/>
+            <w:r>
+              <w:rPr>
+                <w:rFonts w:ascii="TH SarabunPSK" w:hAnsi="TH SarabunPSK" w:cs="TH SarabunPSK"/>
+                <w:sz w:val="32"/>
+                <w:szCs w:val="32"/>
+                <w:lang w:bidi="th-TH"/>
+              </w:rPr>
+              <w:t xml:space="preserve"> authorized, token failed"</w:t>
             </w:r>
           </w:p>
         </w:tc>
         <w:tc>
           <w:tcPr>
             <w:tcW w:w="1417" w:type="dxa"/>
-          </w:tcPr>
-          <w:p>
-            <w:pPr>
+            <w:vAlign w:val="center"/>
+          </w:tcPr>
+          <w:p>
+            <w:pPr>
+              <w:jc w:val="center"/>
               <w:rPr>
                 <w:rFonts w:ascii="TH SarabunPSK" w:hAnsi="TH SarabunPSK" w:cs="TH SarabunPSK"/>
                 <w:sz w:val="32"/>
@@ -6589,13 +8436,23 @@
               </w:rPr>
               <w:t>ด้วย /</w:t>
             </w:r>
-            <w:r>
-              <w:rPr>
-                <w:rFonts w:ascii="TH SarabunPSK" w:hAnsi="TH SarabunPSK" w:cs="TH SarabunPSK"/>
-                <w:sz w:val="32"/>
-                <w:szCs w:val="32"/>
-              </w:rPr>
-              <w:t>api/reports</w:t>
+            <w:proofErr w:type="spellStart"/>
+            <w:r>
+              <w:rPr>
+                <w:rFonts w:ascii="TH SarabunPSK" w:hAnsi="TH SarabunPSK" w:cs="TH SarabunPSK"/>
+                <w:sz w:val="32"/>
+                <w:szCs w:val="32"/>
+              </w:rPr>
+              <w:t>api</w:t>
+            </w:r>
+            <w:proofErr w:type="spellEnd"/>
+            <w:r>
+              <w:rPr>
+                <w:rFonts w:ascii="TH SarabunPSK" w:hAnsi="TH SarabunPSK" w:cs="TH SarabunPSK"/>
+                <w:sz w:val="32"/>
+                <w:szCs w:val="32"/>
+              </w:rPr>
+              <w:t>/reports</w:t>
             </w:r>
           </w:p>
         </w:tc>
@@ -6715,9 +8572,11 @@
         <w:tc>
           <w:tcPr>
             <w:tcW w:w="1417" w:type="dxa"/>
-          </w:tcPr>
-          <w:p>
-            <w:pPr>
+            <w:vAlign w:val="center"/>
+          </w:tcPr>
+          <w:p>
+            <w:pPr>
+              <w:jc w:val="center"/>
               <w:rPr>
                 <w:rFonts w:ascii="TH SarabunPSK" w:hAnsi="TH SarabunPSK" w:cs="TH SarabunPSK"/>
                 <w:sz w:val="32"/>
@@ -6797,7 +8656,7 @@
     </w:p>
     <w:tbl>
       <w:tblPr>
-        <w:tblStyle w:val="a8"/>
+        <w:tblStyle w:val="TableGrid"/>
         <w:tblW w:w="14150" w:type="dxa"/>
         <w:tblInd w:w="-635" w:type="dxa"/>
         <w:tblLook w:val="04A0" w:firstRow="1" w:lastRow="0" w:firstColumn="1" w:lastColumn="0" w:noHBand="0" w:noVBand="1"/>
@@ -7205,9 +9064,11 @@
         <w:tc>
           <w:tcPr>
             <w:tcW w:w="810" w:type="dxa"/>
-          </w:tcPr>
-          <w:p>
-            <w:pPr>
+            <w:vAlign w:val="center"/>
+          </w:tcPr>
+          <w:p>
+            <w:pPr>
+              <w:jc w:val="center"/>
               <w:rPr>
                 <w:rFonts w:ascii="TH SarabunPSK" w:hAnsi="TH SarabunPSK" w:cs="TH SarabunPSK"/>
                 <w:sz w:val="32"/>
@@ -7229,9 +9090,11 @@
         <w:tc>
           <w:tcPr>
             <w:tcW w:w="920" w:type="dxa"/>
-          </w:tcPr>
-          <w:p>
-            <w:pPr>
+            <w:vAlign w:val="center"/>
+          </w:tcPr>
+          <w:p>
+            <w:pPr>
+              <w:jc w:val="center"/>
               <w:rPr>
                 <w:rFonts w:ascii="TH SarabunPSK" w:hAnsi="TH SarabunPSK" w:cs="TH SarabunPSK"/>
                 <w:sz w:val="32"/>
@@ -7253,9 +9116,11 @@
         <w:tc>
           <w:tcPr>
             <w:tcW w:w="810" w:type="dxa"/>
-          </w:tcPr>
-          <w:p>
-            <w:pPr>
+            <w:vAlign w:val="center"/>
+          </w:tcPr>
+          <w:p>
+            <w:pPr>
+              <w:jc w:val="center"/>
               <w:rPr>
                 <w:rFonts w:ascii="TH SarabunPSK" w:hAnsi="TH SarabunPSK" w:cs="TH SarabunPSK"/>
                 <w:sz w:val="32"/>
@@ -7450,9 +9315,11 @@
             <w:tcBorders>
               <w:bottom w:val="single" w:sz="4" w:space="0" w:color="auto"/>
             </w:tcBorders>
-          </w:tcPr>
-          <w:p>
-            <w:pPr>
+            <w:vAlign w:val="center"/>
+          </w:tcPr>
+          <w:p>
+            <w:pPr>
+              <w:jc w:val="center"/>
               <w:rPr>
                 <w:rFonts w:ascii="TH SarabunPSK" w:hAnsi="TH SarabunPSK" w:cs="TH SarabunPSK"/>
                 <w:sz w:val="32"/>
@@ -7477,9 +9344,11 @@
             <w:tcBorders>
               <w:bottom w:val="single" w:sz="4" w:space="0" w:color="auto"/>
             </w:tcBorders>
-          </w:tcPr>
-          <w:p>
-            <w:pPr>
+            <w:vAlign w:val="center"/>
+          </w:tcPr>
+          <w:p>
+            <w:pPr>
+              <w:jc w:val="center"/>
               <w:rPr>
                 <w:rFonts w:ascii="TH SarabunPSK" w:hAnsi="TH SarabunPSK" w:cs="TH SarabunPSK"/>
                 <w:sz w:val="32"/>
@@ -7504,9 +9373,11 @@
             <w:tcBorders>
               <w:bottom w:val="single" w:sz="4" w:space="0" w:color="auto"/>
             </w:tcBorders>
-          </w:tcPr>
-          <w:p>
-            <w:pPr>
+            <w:vAlign w:val="center"/>
+          </w:tcPr>
+          <w:p>
+            <w:pPr>
+              <w:jc w:val="center"/>
               <w:rPr>
                 <w:rFonts w:ascii="TH SarabunPSK" w:hAnsi="TH SarabunPSK" w:cs="TH SarabunPSK"/>
                 <w:sz w:val="32"/>
@@ -7670,9 +9541,11 @@
               <w:bottom w:val="single" w:sz="4" w:space="0" w:color="auto"/>
               <w:right w:val="single" w:sz="4" w:space="0" w:color="auto"/>
             </w:tcBorders>
-          </w:tcPr>
-          <w:p>
-            <w:pPr>
+            <w:vAlign w:val="center"/>
+          </w:tcPr>
+          <w:p>
+            <w:pPr>
+              <w:jc w:val="center"/>
               <w:rPr>
                 <w:rFonts w:ascii="TH SarabunPSK" w:hAnsi="TH SarabunPSK" w:cs="TH SarabunPSK"/>
                 <w:sz w:val="32"/>
@@ -7700,9 +9573,11 @@
               <w:bottom w:val="single" w:sz="4" w:space="0" w:color="auto"/>
               <w:right w:val="single" w:sz="4" w:space="0" w:color="auto"/>
             </w:tcBorders>
-          </w:tcPr>
-          <w:p>
-            <w:pPr>
+            <w:vAlign w:val="center"/>
+          </w:tcPr>
+          <w:p>
+            <w:pPr>
+              <w:jc w:val="center"/>
               <w:rPr>
                 <w:rFonts w:ascii="TH SarabunPSK" w:hAnsi="TH SarabunPSK" w:cs="TH SarabunPSK"/>
                 <w:sz w:val="32"/>
@@ -7730,9 +9605,11 @@
               <w:bottom w:val="single" w:sz="4" w:space="0" w:color="auto"/>
               <w:right w:val="single" w:sz="4" w:space="0" w:color="auto"/>
             </w:tcBorders>
-          </w:tcPr>
-          <w:p>
-            <w:pPr>
+            <w:vAlign w:val="center"/>
+          </w:tcPr>
+          <w:p>
+            <w:pPr>
+              <w:jc w:val="center"/>
               <w:rPr>
                 <w:rFonts w:ascii="TH SarabunPSK" w:hAnsi="TH SarabunPSK" w:cs="TH SarabunPSK"/>
                 <w:sz w:val="32"/>
@@ -7870,7 +9747,7 @@
 <w:hdr xmlns:wpc="http://schemas.microsoft.com/office/word/2010/wordprocessingCanvas" xmlns:cx="http://schemas.microsoft.com/office/drawing/2014/chartex" xmlns:cx1="http://schemas.microsoft.com/office/drawing/2015/9/8/chartex" xmlns:cx2="http://schemas.microsoft.com/office/drawing/2015/10/21/chartex" xmlns:cx3="http://schemas.microsoft.com/office/drawing/2016/5/9/chartex" xmlns:cx4="http://schemas.microsoft.com/office/drawing/2016/5/10/chartex" xmlns:cx5="http://schemas.microsoft.com/office/drawing/2016/5/11/chartex" xmlns:cx6="http://schemas.microsoft.com/office/drawing/2016/5/12/chartex" xmlns:cx7="http://schemas.microsoft.com/office/drawing/2016/5/13/chartex" xmlns:cx8="http://schemas.microsoft.com/office/drawing/2016/5/14/chartex" xmlns:mc="http://schemas.openxmlformats.org/markup-compatibility/2006" xmlns:aink="http://schemas.microsoft.com/office/drawing/2016/ink" xmlns:am3d="http://schemas.microsoft.com/office/drawing/2017/model3d" xmlns:o="urn:schemas-microsoft-com:office:office" xmlns:oel="http://schemas.microsoft.com/office/2019/extlst" xmlns:r="http://schemas.openxmlformats.org/officeDocument/2006/relationships" xmlns:m="http://schemas.openxmlformats.org/officeDocument/2006/math" xmlns:v="urn:schemas-microsoft-com:vml" xmlns:wp14="http://schemas.microsoft.com/office/word/2010/wordprocessingDrawing" xmlns:wp="http://schemas.openxmlformats.org/drawingml/2006/wordprocessingDrawing" xmlns:w10="urn:schemas-microsoft-com:office:word" xmlns:w="http://schemas.openxmlformats.org/wordprocessingml/2006/main" xmlns:w14="http://schemas.microsoft.com/office/word/2010/wordml" xmlns:w15="http://schemas.microsoft.com/office/word/2012/wordml" xmlns:w16cex="http://schemas.microsoft.com/office/word/2018/wordml/cex" xmlns:w16cid="http://schemas.microsoft.com/office/word/2016/wordml/cid" xmlns:w16="http://schemas.microsoft.com/office/word/2018/wordml" xmlns:w16du="http://schemas.microsoft.com/office/word/2023/wordml/word16du" xmlns:w16sdtdh="http://schemas.microsoft.com/office/word/2020/wordml/sdtdatahash" xmlns:w16sdtfl="http://schemas.microsoft.com/office/word/2024/wordml/sdtformatlock" xmlns:w16se="http://schemas.microsoft.com/office/word/2015/wordml/symex" xmlns:wpg="http://schemas.microsoft.com/office/word/2010/wordprocessingGroup" xmlns:wpi="http://schemas.microsoft.com/office/word/2010/wordprocessingInk" xmlns:wne="http://schemas.microsoft.com/office/word/2006/wordml" xmlns:wps="http://schemas.microsoft.com/office/word/2010/wordprocessingShape" mc:Ignorable="w14 w15 w16se w16cid w16 w16cex w16sdtdh w16sdtfl w16du wp14">
   <w:p>
     <w:pPr>
-      <w:pStyle w:val="a3"/>
+      <w:pStyle w:val="Header"/>
       <w:rPr>
         <w:rFonts w:ascii="TH SarabunPSK" w:hAnsi="TH SarabunPSK" w:cs="TH SarabunPSK"/>
         <w:b/>
@@ -8054,7 +9931,7 @@
   </w:p>
   <w:p>
     <w:pPr>
-      <w:pStyle w:val="a3"/>
+      <w:pStyle w:val="Header"/>
       <w:rPr>
         <w:rFonts w:ascii="TH SarabunPSK" w:hAnsi="TH SarabunPSK" w:cs="TH SarabunPSK"/>
         <w:b/>
@@ -10288,17 +12165,17 @@
     <w:lsdException w:name="Unresolved Mention" w:semiHidden="1" w:unhideWhenUsed="1"/>
     <w:lsdException w:name="Smart Link" w:semiHidden="1" w:unhideWhenUsed="1"/>
   </w:latentStyles>
-  <w:style w:type="paragraph" w:default="1" w:styleId="a">
+  <w:style w:type="paragraph" w:default="1" w:styleId="Normal">
     <w:name w:val="Normal"/>
     <w:qFormat/>
   </w:style>
-  <w:style w:type="character" w:default="1" w:styleId="a0">
+  <w:style w:type="character" w:default="1" w:styleId="DefaultParagraphFont">
     <w:name w:val="Default Paragraph Font"/>
     <w:uiPriority w:val="1"/>
     <w:semiHidden/>
     <w:unhideWhenUsed/>
   </w:style>
-  <w:style w:type="table" w:default="1" w:styleId="a1">
+  <w:style w:type="table" w:default="1" w:styleId="TableNormal">
     <w:name w:val="Normal Table"/>
     <w:uiPriority w:val="99"/>
     <w:semiHidden/>
@@ -10313,16 +12190,16 @@
       </w:tblCellMar>
     </w:tblPr>
   </w:style>
-  <w:style w:type="numbering" w:default="1" w:styleId="a2">
+  <w:style w:type="numbering" w:default="1" w:styleId="NoList">
     <w:name w:val="No List"/>
     <w:uiPriority w:val="99"/>
     <w:semiHidden/>
     <w:unhideWhenUsed/>
   </w:style>
-  <w:style w:type="paragraph" w:styleId="a3">
+  <w:style w:type="paragraph" w:styleId="Header">
     <w:name w:val="header"/>
-    <w:basedOn w:val="a"/>
-    <w:link w:val="a4"/>
+    <w:basedOn w:val="Normal"/>
+    <w:link w:val="HeaderChar"/>
     <w:uiPriority w:val="99"/>
     <w:unhideWhenUsed/>
     <w:rsid w:val="00C87900"/>
@@ -10334,17 +12211,17 @@
       <w:spacing w:after="0" w:line="240" w:lineRule="auto"/>
     </w:pPr>
   </w:style>
-  <w:style w:type="character" w:customStyle="1" w:styleId="a4">
-    <w:name w:val="หัวกระดาษ อักขระ"/>
-    <w:basedOn w:val="a0"/>
-    <w:link w:val="a3"/>
+  <w:style w:type="character" w:customStyle="1" w:styleId="HeaderChar">
+    <w:name w:val="Header Char"/>
+    <w:basedOn w:val="DefaultParagraphFont"/>
+    <w:link w:val="Header"/>
     <w:uiPriority w:val="99"/>
     <w:rsid w:val="00C87900"/>
   </w:style>
-  <w:style w:type="paragraph" w:styleId="a5">
+  <w:style w:type="paragraph" w:styleId="Footer">
     <w:name w:val="footer"/>
-    <w:basedOn w:val="a"/>
-    <w:link w:val="a6"/>
+    <w:basedOn w:val="Normal"/>
+    <w:link w:val="FooterChar"/>
     <w:uiPriority w:val="99"/>
     <w:unhideWhenUsed/>
     <w:rsid w:val="00C87900"/>
@@ -10356,16 +12233,16 @@
       <w:spacing w:after="0" w:line="240" w:lineRule="auto"/>
     </w:pPr>
   </w:style>
-  <w:style w:type="character" w:customStyle="1" w:styleId="a6">
-    <w:name w:val="ท้ายกระดาษ อักขระ"/>
-    <w:basedOn w:val="a0"/>
-    <w:link w:val="a5"/>
+  <w:style w:type="character" w:customStyle="1" w:styleId="FooterChar">
+    <w:name w:val="Footer Char"/>
+    <w:basedOn w:val="DefaultParagraphFont"/>
+    <w:link w:val="Footer"/>
     <w:uiPriority w:val="99"/>
     <w:rsid w:val="00C87900"/>
   </w:style>
-  <w:style w:type="paragraph" w:styleId="a7">
+  <w:style w:type="paragraph" w:styleId="ListParagraph">
     <w:name w:val="List Paragraph"/>
-    <w:basedOn w:val="a"/>
+    <w:basedOn w:val="Normal"/>
     <w:uiPriority w:val="34"/>
     <w:qFormat/>
     <w:rsid w:val="00C87900"/>
@@ -10374,9 +12251,9 @@
       <w:contextualSpacing/>
     </w:pPr>
   </w:style>
-  <w:style w:type="table" w:styleId="a8">
+  <w:style w:type="table" w:styleId="TableGrid">
     <w:name w:val="Table Grid"/>
-    <w:basedOn w:val="a1"/>
+    <w:basedOn w:val="TableNormal"/>
     <w:uiPriority w:val="39"/>
     <w:rsid w:val="00C2238F"/>
     <w:pPr>
@@ -10393,9 +12270,9 @@
       </w:tblBorders>
     </w:tblPr>
   </w:style>
-  <w:style w:type="character" w:styleId="a9">
+  <w:style w:type="character" w:styleId="Hyperlink">
     <w:name w:val="Hyperlink"/>
-    <w:basedOn w:val="a0"/>
+    <w:basedOn w:val="DefaultParagraphFont"/>
     <w:uiPriority w:val="99"/>
     <w:unhideWhenUsed/>
     <w:rsid w:val="00B77A1F"/>

</xml_diff>